<commit_message>
Update log sheets docx and cleanup unused routes
</commit_message>
<xml_diff>
--- a/icbt_project_log_sheets.docx
+++ b/icbt_project_log_sheets.docx
@@ -4,37 +4,27 @@
   <w:body>
     <w:p>
       <w:pPr>
-        <w:spacing w:before="0" w:after="40"/>
+        <w:spacing w:after="200"/>
         <w:jc w:val="center"/>
       </w:pPr>
       <w:r>
         <w:rPr>
           <w:rFonts w:ascii="Arial" w:hAnsi="Arial"/>
           <w:b/>
-          <w:sz w:val="24"/>
+          <w:i w:val="0"/>
+          <w:color w:val="0F172A"/>
+          <w:sz w:val="22"/>
         </w:rPr>
-        <w:t>CARDIFF METROPOLITAN UNIVERSITY / ICBT CAMPUS</w:t>
+        <w:t>ICBT CAMPUS - SCHOOL OF COMPUTING</w:t>
         <w:br/>
+        <w:t>SOFTWARE ENGINEERING PROJECT (DISSERTATION) LOG SHEET</w:t>
       </w:r>
-      <w:r>
-        <w:rPr>
-          <w:rFonts w:ascii="Arial" w:hAnsi="Arial"/>
-          <w:b/>
-          <w:color w:val="1E293B"/>
-          <w:sz w:val="21"/>
-        </w:rPr>
-        <w:t>BSc (Hons) in Software Engineering — Project Supervision Log Sheet</w:t>
-      </w:r>
-    </w:p>
-    <w:p>
-      <w:pPr>
-        <w:spacing w:after="80"/>
-      </w:pPr>
     </w:p>
     <w:tbl>
       <w:tblPr>
         <w:tblW w:type="auto" w:w="0"/>
         <w:jc w:val="center"/>
+        <w:tblLayout w:type="fixed"/>
         <w:tblLook w:firstColumn="1" w:firstRow="1" w:lastColumn="0" w:lastRow="0" w:noHBand="0" w:noVBand="1" w:val="04A0"/>
       </w:tblPr>
       <w:tblGrid>
@@ -45,22 +35,21 @@
         <w:tc>
           <w:tcPr>
             <w:tcW w:type="dxa" w:w="2880"/>
-            <w:shd w:val="clear" w:color="auto" w:fill="F1F5F9"/>
+            <w:shd w:fill="1E293B"/>
             <w:tcMar>
-              <w:top w:w="80" w:type="dxa"/>
-              <w:bottom w:w="80" w:type="dxa"/>
+              <w:top w:w="70" w:type="dxa"/>
+              <w:bottom w:w="70" w:type="dxa"/>
               <w:left w:w="120" w:type="dxa"/>
               <w:right w:w="120" w:type="dxa"/>
             </w:tcMar>
           </w:tcPr>
           <w:p>
-            <w:pPr>
-              <w:spacing w:after="0"/>
-            </w:pPr>
             <w:r>
               <w:rPr>
                 <w:rFonts w:ascii="Arial" w:hAnsi="Arial"/>
                 <w:b/>
+                <w:i w:val="0"/>
+                <w:color w:val="FFFFFF"/>
                 <w:sz w:val="19"/>
               </w:rPr>
               <w:t>Student Name &amp; ID:</w:t>
@@ -69,19 +58,24 @@
         </w:tc>
         <w:tc>
           <w:tcPr>
-            <w:tcW w:type="dxa" w:w="7200"/>
+            <w:tcW w:type="dxa" w:w="6912"/>
+            <w:shd w:fill="F8FAFC"/>
             <w:tcMar>
-              <w:top w:w="80" w:type="dxa"/>
-              <w:bottom w:w="80" w:type="dxa"/>
+              <w:top w:w="70" w:type="dxa"/>
+              <w:bottom w:w="70" w:type="dxa"/>
               <w:left w:w="120" w:type="dxa"/>
               <w:right w:w="120" w:type="dxa"/>
             </w:tcMar>
           </w:tcPr>
           <w:p>
-            <w:pPr>
-              <w:spacing w:after="0"/>
-            </w:pPr>
             <w:r>
+              <w:rPr>
+                <w:rFonts w:ascii="Arial" w:hAnsi="Arial"/>
+                <w:b/>
+                <w:i w:val="0"/>
+                <w:color w:val="0F172A"/>
+                <w:sz w:val="19"/>
+              </w:rPr>
               <w:t>Sadeepa Sewmini (Student ID: CB011000)</w:t>
             </w:r>
           </w:p>
@@ -91,22 +85,21 @@
         <w:tc>
           <w:tcPr>
             <w:tcW w:type="dxa" w:w="2880"/>
-            <w:shd w:val="clear" w:color="auto" w:fill="F1F5F9"/>
+            <w:shd w:fill="1E293B"/>
             <w:tcMar>
-              <w:top w:w="80" w:type="dxa"/>
-              <w:bottom w:w="80" w:type="dxa"/>
+              <w:top w:w="70" w:type="dxa"/>
+              <w:bottom w:w="70" w:type="dxa"/>
               <w:left w:w="120" w:type="dxa"/>
               <w:right w:w="120" w:type="dxa"/>
             </w:tcMar>
           </w:tcPr>
           <w:p>
-            <w:pPr>
-              <w:spacing w:after="0"/>
-            </w:pPr>
             <w:r>
               <w:rPr>
                 <w:rFonts w:ascii="Arial" w:hAnsi="Arial"/>
                 <w:b/>
+                <w:i w:val="0"/>
+                <w:color w:val="FFFFFF"/>
                 <w:sz w:val="19"/>
               </w:rPr>
               <w:t>Project Title:</w:t>
@@ -115,19 +108,24 @@
         </w:tc>
         <w:tc>
           <w:tcPr>
-            <w:tcW w:type="dxa" w:w="7200"/>
+            <w:tcW w:type="dxa" w:w="6912"/>
+            <w:shd w:fill="F8FAFC"/>
             <w:tcMar>
-              <w:top w:w="80" w:type="dxa"/>
-              <w:bottom w:w="80" w:type="dxa"/>
+              <w:top w:w="70" w:type="dxa"/>
+              <w:bottom w:w="70" w:type="dxa"/>
               <w:left w:w="120" w:type="dxa"/>
               <w:right w:w="120" w:type="dxa"/>
             </w:tcMar>
           </w:tcPr>
           <w:p>
-            <w:pPr>
-              <w:spacing w:after="0"/>
-            </w:pPr>
             <w:r>
+              <w:rPr>
+                <w:rFonts w:ascii="Arial" w:hAnsi="Arial"/>
+                <w:b/>
+                <w:i w:val="0"/>
+                <w:color w:val="0F172A"/>
+                <w:sz w:val="19"/>
+              </w:rPr>
               <w:t>Safora: AI-Powered Street Crime Prediction, Real-Time Hazard Mapping &amp; Community Emergency Response Platform</w:t>
             </w:r>
           </w:p>
@@ -137,22 +135,21 @@
         <w:tc>
           <w:tcPr>
             <w:tcW w:type="dxa" w:w="2880"/>
-            <w:shd w:val="clear" w:color="auto" w:fill="F1F5F9"/>
+            <w:shd w:fill="1E293B"/>
             <w:tcMar>
-              <w:top w:w="80" w:type="dxa"/>
-              <w:bottom w:w="80" w:type="dxa"/>
+              <w:top w:w="70" w:type="dxa"/>
+              <w:bottom w:w="70" w:type="dxa"/>
               <w:left w:w="120" w:type="dxa"/>
               <w:right w:w="120" w:type="dxa"/>
             </w:tcMar>
           </w:tcPr>
           <w:p>
-            <w:pPr>
-              <w:spacing w:after="0"/>
-            </w:pPr>
             <w:r>
               <w:rPr>
                 <w:rFonts w:ascii="Arial" w:hAnsi="Arial"/>
                 <w:b/>
+                <w:i w:val="0"/>
+                <w:color w:val="FFFFFF"/>
                 <w:sz w:val="19"/>
               </w:rPr>
               <w:t>Supervisor Name:</w:t>
@@ -161,19 +158,24 @@
         </w:tc>
         <w:tc>
           <w:tcPr>
-            <w:tcW w:type="dxa" w:w="7200"/>
+            <w:tcW w:type="dxa" w:w="6912"/>
+            <w:shd w:fill="F8FAFC"/>
             <w:tcMar>
-              <w:top w:w="80" w:type="dxa"/>
-              <w:bottom w:w="80" w:type="dxa"/>
+              <w:top w:w="70" w:type="dxa"/>
+              <w:bottom w:w="70" w:type="dxa"/>
               <w:left w:w="120" w:type="dxa"/>
               <w:right w:w="120" w:type="dxa"/>
             </w:tcMar>
           </w:tcPr>
           <w:p>
-            <w:pPr>
-              <w:spacing w:after="0"/>
-            </w:pPr>
             <w:r>
+              <w:rPr>
+                <w:rFonts w:ascii="Arial" w:hAnsi="Arial"/>
+                <w:b w:val="0"/>
+                <w:i w:val="0"/>
+                <w:color w:val="0F172A"/>
+                <w:sz w:val="19"/>
+              </w:rPr>
               <w:t>Dr. / Mr. Academic Supervisor</w:t>
             </w:r>
           </w:p>
@@ -183,22 +185,21 @@
         <w:tc>
           <w:tcPr>
             <w:tcW w:type="dxa" w:w="2880"/>
-            <w:shd w:val="clear" w:color="auto" w:fill="F1F5F9"/>
+            <w:shd w:fill="1E293B"/>
             <w:tcMar>
-              <w:top w:w="80" w:type="dxa"/>
-              <w:bottom w:w="80" w:type="dxa"/>
+              <w:top w:w="70" w:type="dxa"/>
+              <w:bottom w:w="70" w:type="dxa"/>
               <w:left w:w="120" w:type="dxa"/>
               <w:right w:w="120" w:type="dxa"/>
             </w:tcMar>
           </w:tcPr>
           <w:p>
-            <w:pPr>
-              <w:spacing w:after="0"/>
-            </w:pPr>
             <w:r>
               <w:rPr>
                 <w:rFonts w:ascii="Arial" w:hAnsi="Arial"/>
                 <w:b/>
+                <w:i w:val="0"/>
+                <w:color w:val="FFFFFF"/>
                 <w:sz w:val="19"/>
               </w:rPr>
               <w:t>Module:</w:t>
@@ -207,19 +208,24 @@
         </w:tc>
         <w:tc>
           <w:tcPr>
-            <w:tcW w:type="dxa" w:w="7200"/>
+            <w:tcW w:type="dxa" w:w="6912"/>
+            <w:shd w:fill="F8FAFC"/>
             <w:tcMar>
-              <w:top w:w="80" w:type="dxa"/>
-              <w:bottom w:w="80" w:type="dxa"/>
+              <w:top w:w="70" w:type="dxa"/>
+              <w:bottom w:w="70" w:type="dxa"/>
               <w:left w:w="120" w:type="dxa"/>
               <w:right w:w="120" w:type="dxa"/>
             </w:tcMar>
           </w:tcPr>
           <w:p>
-            <w:pPr>
-              <w:spacing w:after="0"/>
-            </w:pPr>
             <w:r>
+              <w:rPr>
+                <w:rFonts w:ascii="Arial" w:hAnsi="Arial"/>
+                <w:b w:val="0"/>
+                <w:i w:val="0"/>
+                <w:color w:val="0F172A"/>
+                <w:sz w:val="19"/>
+              </w:rPr>
               <w:t>CIS6035 - Software Engineering Project (Dissertation)</w:t>
             </w:r>
           </w:p>
@@ -229,22 +235,21 @@
         <w:tc>
           <w:tcPr>
             <w:tcW w:type="dxa" w:w="2880"/>
-            <w:shd w:val="clear" w:color="auto" w:fill="F1F5F9"/>
+            <w:shd w:fill="1E293B"/>
             <w:tcMar>
-              <w:top w:w="80" w:type="dxa"/>
-              <w:bottom w:w="80" w:type="dxa"/>
+              <w:top w:w="70" w:type="dxa"/>
+              <w:bottom w:w="70" w:type="dxa"/>
               <w:left w:w="120" w:type="dxa"/>
               <w:right w:w="120" w:type="dxa"/>
             </w:tcMar>
           </w:tcPr>
           <w:p>
-            <w:pPr>
-              <w:spacing w:after="0"/>
-            </w:pPr>
             <w:r>
               <w:rPr>
                 <w:rFonts w:ascii="Arial" w:hAnsi="Arial"/>
                 <w:b/>
+                <w:i w:val="0"/>
+                <w:color w:val="FFFFFF"/>
                 <w:sz w:val="19"/>
               </w:rPr>
               <w:t>Meeting Details:</w:t>
@@ -253,19 +258,24 @@
         </w:tc>
         <w:tc>
           <w:tcPr>
-            <w:tcW w:type="dxa" w:w="7200"/>
+            <w:tcW w:type="dxa" w:w="6912"/>
+            <w:shd w:fill="F8FAFC"/>
             <w:tcMar>
-              <w:top w:w="80" w:type="dxa"/>
-              <w:bottom w:w="80" w:type="dxa"/>
+              <w:top w:w="70" w:type="dxa"/>
+              <w:bottom w:w="70" w:type="dxa"/>
               <w:left w:w="120" w:type="dxa"/>
               <w:right w:w="120" w:type="dxa"/>
             </w:tcMar>
           </w:tcPr>
           <w:p>
-            <w:pPr>
-              <w:spacing w:after="0"/>
-            </w:pPr>
             <w:r>
+              <w:rPr>
+                <w:rFonts w:ascii="Arial" w:hAnsi="Arial"/>
+                <w:b/>
+                <w:i w:val="0"/>
+                <w:color w:val="0F172A"/>
+                <w:sz w:val="19"/>
+              </w:rPr>
               <w:t>Meeting No: 01   |   Date: July 02, 2026   |   Time: 10:00 AM - 10:45 AM (45 Minutes)</w:t>
             </w:r>
           </w:p>
@@ -281,6 +291,7 @@
       <w:tblPr>
         <w:tblW w:type="auto" w:w="0"/>
         <w:jc w:val="center"/>
+        <w:tblLayout w:type="fixed"/>
         <w:tblLook w:firstColumn="1" w:firstRow="1" w:lastColumn="0" w:lastRow="0" w:noHBand="0" w:noVBand="1" w:val="04A0"/>
       </w:tblPr>
       <w:tblGrid>
@@ -290,23 +301,22 @@
       <w:tr>
         <w:tc>
           <w:tcPr>
-            <w:tcW w:type="dxa" w:w="3168"/>
-            <w:shd w:val="clear" w:color="auto" w:fill="F8FAFC"/>
+            <w:tcW w:type="dxa" w:w="2880"/>
+            <w:shd w:fill="0F172A"/>
             <w:tcMar>
-              <w:top w:w="100" w:type="dxa"/>
-              <w:bottom w:w="100" w:type="dxa"/>
+              <w:top w:w="80" w:type="dxa"/>
+              <w:bottom w:w="80" w:type="dxa"/>
               <w:left w:w="120" w:type="dxa"/>
               <w:right w:w="120" w:type="dxa"/>
             </w:tcMar>
           </w:tcPr>
           <w:p>
-            <w:pPr>
-              <w:spacing w:after="0"/>
-            </w:pPr>
             <w:r>
               <w:rPr>
                 <w:rFonts w:ascii="Arial" w:hAnsi="Arial"/>
                 <w:b/>
+                <w:i w:val="0"/>
+                <w:color w:val="FFFFFF"/>
                 <w:sz w:val="19"/>
               </w:rPr>
               <w:t>Meeting Mode / Location</w:t>
@@ -316,18 +326,23 @@
         <w:tc>
           <w:tcPr>
             <w:tcW w:type="dxa" w:w="6912"/>
+            <w:shd w:fill="FFFFFF"/>
             <w:tcMar>
-              <w:top w:w="100" w:type="dxa"/>
-              <w:bottom w:w="100" w:type="dxa"/>
+              <w:top w:w="80" w:type="dxa"/>
+              <w:bottom w:w="80" w:type="dxa"/>
               <w:left w:w="120" w:type="dxa"/>
               <w:right w:w="120" w:type="dxa"/>
             </w:tcMar>
           </w:tcPr>
           <w:p>
-            <w:pPr>
-              <w:spacing w:after="0" w:line="276" w:lineRule="auto"/>
-            </w:pPr>
             <w:r>
+              <w:rPr>
+                <w:rFonts w:ascii="Arial" w:hAnsi="Arial"/>
+                <w:b/>
+                <w:i w:val="0"/>
+                <w:color w:val="0F172A"/>
+                <w:sz w:val="18"/>
+              </w:rPr>
               <w:t>In-Person (ICBT Campus Supervisor Office)</w:t>
             </w:r>
           </w:p>
@@ -336,23 +351,22 @@
       <w:tr>
         <w:tc>
           <w:tcPr>
-            <w:tcW w:type="dxa" w:w="3168"/>
-            <w:shd w:val="clear" w:color="auto" w:fill="F8FAFC"/>
+            <w:tcW w:type="dxa" w:w="2880"/>
+            <w:shd w:fill="0F172A"/>
             <w:tcMar>
-              <w:top w:w="100" w:type="dxa"/>
-              <w:bottom w:w="100" w:type="dxa"/>
+              <w:top w:w="80" w:type="dxa"/>
+              <w:bottom w:w="80" w:type="dxa"/>
               <w:left w:w="120" w:type="dxa"/>
               <w:right w:w="120" w:type="dxa"/>
             </w:tcMar>
           </w:tcPr>
           <w:p>
-            <w:pPr>
-              <w:spacing w:after="0"/>
-            </w:pPr>
             <w:r>
               <w:rPr>
                 <w:rFonts w:ascii="Arial" w:hAnsi="Arial"/>
                 <w:b/>
+                <w:i w:val="0"/>
+                <w:color w:val="FFFFFF"/>
                 <w:sz w:val="19"/>
               </w:rPr>
               <w:t>Objectives &amp; Agenda</w:t>
@@ -362,19 +376,24 @@
         <w:tc>
           <w:tcPr>
             <w:tcW w:type="dxa" w:w="6912"/>
+            <w:shd w:fill="FFFFFF"/>
             <w:tcMar>
-              <w:top w:w="100" w:type="dxa"/>
-              <w:bottom w:w="100" w:type="dxa"/>
+              <w:top w:w="80" w:type="dxa"/>
+              <w:bottom w:w="80" w:type="dxa"/>
               <w:left w:w="120" w:type="dxa"/>
               <w:right w:w="120" w:type="dxa"/>
             </w:tcMar>
           </w:tcPr>
           <w:p>
-            <w:pPr>
-              <w:spacing w:after="0" w:line="276" w:lineRule="auto"/>
-            </w:pPr>
             <w:r>
-              <w:t>Project Selection &amp; Title Discussion.</w:t>
+              <w:rPr>
+                <w:rFonts w:ascii="Arial" w:hAnsi="Arial"/>
+                <w:b/>
+                <w:i w:val="0"/>
+                <w:color w:val="0F172A"/>
+                <w:sz w:val="18"/>
+              </w:rPr>
+              <w:t>Project Title Selection &amp; Topic Finalization Discussion.</w:t>
             </w:r>
           </w:p>
         </w:tc>
@@ -382,23 +401,22 @@
       <w:tr>
         <w:tc>
           <w:tcPr>
-            <w:tcW w:type="dxa" w:w="3168"/>
-            <w:shd w:val="clear" w:color="auto" w:fill="F8FAFC"/>
+            <w:tcW w:type="dxa" w:w="2880"/>
+            <w:shd w:fill="0F172A"/>
             <w:tcMar>
-              <w:top w:w="100" w:type="dxa"/>
-              <w:bottom w:w="100" w:type="dxa"/>
+              <w:top w:w="80" w:type="dxa"/>
+              <w:bottom w:w="80" w:type="dxa"/>
               <w:left w:w="120" w:type="dxa"/>
               <w:right w:w="120" w:type="dxa"/>
             </w:tcMar>
           </w:tcPr>
           <w:p>
-            <w:pPr>
-              <w:spacing w:after="0"/>
-            </w:pPr>
             <w:r>
               <w:rPr>
                 <w:rFonts w:ascii="Arial" w:hAnsi="Arial"/>
                 <w:b/>
+                <w:i w:val="0"/>
+                <w:color w:val="FFFFFF"/>
                 <w:sz w:val="19"/>
               </w:rPr>
               <w:t>Discussion Summary &amp; Progress Made</w:t>
@@ -408,46 +426,30 @@
         <w:tc>
           <w:tcPr>
             <w:tcW w:type="dxa" w:w="6912"/>
+            <w:shd w:fill="FFFFFF"/>
             <w:tcMar>
-              <w:top w:w="100" w:type="dxa"/>
-              <w:bottom w:w="100" w:type="dxa"/>
+              <w:top w:w="80" w:type="dxa"/>
+              <w:bottom w:w="80" w:type="dxa"/>
               <w:left w:w="120" w:type="dxa"/>
               <w:right w:w="120" w:type="dxa"/>
             </w:tcMar>
           </w:tcPr>
           <w:p>
-            <w:r/>
-          </w:p>
-          <w:p>
-            <w:pPr>
-              <w:spacing w:after="80" w:line="276" w:lineRule="auto"/>
-            </w:pPr>
             <w:r>
-              <w:t>• Initial consultation with the academic supervisor regarding the selection and finalization of the project title.</w:t>
-            </w:r>
-          </w:p>
-          <w:p>
-            <w:pPr>
-              <w:spacing w:after="80" w:line="276" w:lineRule="auto"/>
-            </w:pPr>
-            <w:r>
-              <w:t>• Proposed and evaluated the project title: 'Safora: AI-Powered Street Crime Prediction, Real-Time Hazard Mapping &amp; Community Emergency Response Platform'.</w:t>
-            </w:r>
-          </w:p>
-          <w:p>
-            <w:pPr>
-              <w:spacing w:after="80" w:line="276" w:lineRule="auto"/>
-            </w:pPr>
-            <w:r>
-              <w:t>• Discussed the research background, target audience (commuters, citizens, public safety authorities in Sri Lanka), and technical scope of the chosen title.</w:t>
-            </w:r>
-          </w:p>
-          <w:p>
-            <w:pPr>
-              <w:spacing w:after="80" w:line="276" w:lineRule="auto"/>
-            </w:pPr>
-            <w:r>
-              <w:t>• Academic supervisor reviewed the proposed topic and formally approved the title and scope for project progression.</w:t>
+              <w:rPr>
+                <w:rFonts w:ascii="Arial" w:hAnsi="Arial"/>
+                <w:b w:val="0"/>
+                <w:i w:val="0"/>
+                <w:color w:val="0F172A"/>
+                <w:sz w:val="18"/>
+              </w:rPr>
+              <w:t>• Initial consultation with the academic supervisor focused exclusively on selecting and finalizing the dissertation project title.</w:t>
+              <w:br/>
+              <w:t>• Proposed, presented, and evaluated the project title: 'Safora: AI-Powered Street Crime Prediction, Real-Time Hazard Mapping &amp; Community Emergency Response Platform'.</w:t>
+              <w:br/>
+              <w:t>• Discussed the research background, target domain, problem rationale, and technical scope of the chosen project title.</w:t>
+              <w:br/>
+              <w:t>• Academic supervisor evaluated the proposed title and formally granted approval for project registration under the finalized title.</w:t>
             </w:r>
           </w:p>
         </w:tc>
@@ -455,23 +457,22 @@
       <w:tr>
         <w:tc>
           <w:tcPr>
-            <w:tcW w:type="dxa" w:w="3168"/>
-            <w:shd w:val="clear" w:color="auto" w:fill="F8FAFC"/>
+            <w:tcW w:type="dxa" w:w="2880"/>
+            <w:shd w:fill="0F172A"/>
             <w:tcMar>
-              <w:top w:w="100" w:type="dxa"/>
-              <w:bottom w:w="100" w:type="dxa"/>
+              <w:top w:w="80" w:type="dxa"/>
+              <w:bottom w:w="80" w:type="dxa"/>
               <w:left w:w="120" w:type="dxa"/>
               <w:right w:w="120" w:type="dxa"/>
             </w:tcMar>
           </w:tcPr>
           <w:p>
-            <w:pPr>
-              <w:spacing w:after="0"/>
-            </w:pPr>
             <w:r>
               <w:rPr>
                 <w:rFonts w:ascii="Arial" w:hAnsi="Arial"/>
                 <w:b/>
+                <w:i w:val="0"/>
+                <w:color w:val="FFFFFF"/>
                 <w:sz w:val="19"/>
               </w:rPr>
               <w:t>Action Items &amp; Work Assigned</w:t>
@@ -481,30 +482,26 @@
         <w:tc>
           <w:tcPr>
             <w:tcW w:type="dxa" w:w="6912"/>
+            <w:shd w:fill="FFFFFF"/>
             <w:tcMar>
-              <w:top w:w="100" w:type="dxa"/>
-              <w:bottom w:w="100" w:type="dxa"/>
+              <w:top w:w="80" w:type="dxa"/>
+              <w:bottom w:w="80" w:type="dxa"/>
               <w:left w:w="120" w:type="dxa"/>
               <w:right w:w="120" w:type="dxa"/>
             </w:tcMar>
           </w:tcPr>
           <w:p>
-            <w:r/>
-          </w:p>
-          <w:p>
-            <w:pPr>
-              <w:spacing w:after="80" w:line="276" w:lineRule="auto"/>
-            </w:pPr>
             <w:r>
-              <w:t>• Conduct literature review on spatial crime prediction models and GIS spatial analysis algorithms.</w:t>
-            </w:r>
-          </w:p>
-          <w:p>
-            <w:pPr>
-              <w:spacing w:after="80" w:line="276" w:lineRule="auto"/>
-            </w:pPr>
-            <w:r>
-              <w:t>• Formulate preliminary requirement gathering strategy (surveys and stakeholder interviews).</w:t>
+              <w:rPr>
+                <w:rFonts w:ascii="Arial" w:hAnsi="Arial"/>
+                <w:b w:val="0"/>
+                <w:i w:val="0"/>
+                <w:color w:val="0F172A"/>
+                <w:sz w:val="18"/>
+              </w:rPr>
+              <w:t>• Conduct preliminary background literature review on spatial crime prediction models and GIS spatial algorithms.</w:t>
+              <w:br/>
+              <w:t>• Formulate preliminary requirement gathering strategy (surveys and stakeholder interviews) for the approved title.</w:t>
             </w:r>
           </w:p>
         </w:tc>
@@ -512,23 +509,22 @@
       <w:tr>
         <w:tc>
           <w:tcPr>
-            <w:tcW w:type="dxa" w:w="3168"/>
-            <w:shd w:val="clear" w:color="auto" w:fill="F8FAFC"/>
+            <w:tcW w:type="dxa" w:w="2880"/>
+            <w:shd w:fill="0F172A"/>
             <w:tcMar>
-              <w:top w:w="100" w:type="dxa"/>
-              <w:bottom w:w="100" w:type="dxa"/>
+              <w:top w:w="80" w:type="dxa"/>
+              <w:bottom w:w="80" w:type="dxa"/>
               <w:left w:w="120" w:type="dxa"/>
               <w:right w:w="120" w:type="dxa"/>
             </w:tcMar>
           </w:tcPr>
           <w:p>
-            <w:pPr>
-              <w:spacing w:after="0"/>
-            </w:pPr>
             <w:r>
               <w:rPr>
                 <w:rFonts w:ascii="Arial" w:hAnsi="Arial"/>
                 <w:b/>
+                <w:i w:val="0"/>
+                <w:color w:val="FFFFFF"/>
                 <w:sz w:val="19"/>
               </w:rPr>
               <w:t>Target Completion Date</w:t>
@@ -538,18 +534,23 @@
         <w:tc>
           <w:tcPr>
             <w:tcW w:type="dxa" w:w="6912"/>
+            <w:shd w:fill="FFFFFF"/>
             <w:tcMar>
-              <w:top w:w="100" w:type="dxa"/>
-              <w:bottom w:w="100" w:type="dxa"/>
+              <w:top w:w="80" w:type="dxa"/>
+              <w:bottom w:w="80" w:type="dxa"/>
               <w:left w:w="120" w:type="dxa"/>
               <w:right w:w="120" w:type="dxa"/>
             </w:tcMar>
           </w:tcPr>
           <w:p>
-            <w:pPr>
-              <w:spacing w:after="0" w:line="276" w:lineRule="auto"/>
-            </w:pPr>
             <w:r>
+              <w:rPr>
+                <w:rFonts w:ascii="Arial" w:hAnsi="Arial"/>
+                <w:b/>
+                <w:i w:val="0"/>
+                <w:color w:val="0F172A"/>
+                <w:sz w:val="18"/>
+              </w:rPr>
               <w:t>August 08, 2026</w:t>
             </w:r>
           </w:p>
@@ -565,6 +566,7 @@
       <w:tblPr>
         <w:tblW w:type="auto" w:w="0"/>
         <w:jc w:val="center"/>
+        <w:tblLayout w:type="fixed"/>
         <w:tblLook w:firstColumn="1" w:firstRow="1" w:lastColumn="0" w:lastRow="0" w:noHBand="0" w:noVBand="1" w:val="04A0"/>
       </w:tblPr>
       <w:tblGrid>
@@ -573,46 +575,52 @@
       <w:tr>
         <w:tc>
           <w:tcPr>
-            <w:tcW w:type="dxa" w:w="10080"/>
+            <w:tcW w:type="dxa" w:w="9792"/>
+            <w:shd w:fill="F8FAFC"/>
             <w:tcMar>
-              <w:top w:w="100" w:type="dxa"/>
-              <w:bottom w:w="100" w:type="dxa"/>
+              <w:top w:w="80" w:type="dxa"/>
+              <w:bottom w:w="120" w:type="dxa"/>
               <w:left w:w="120" w:type="dxa"/>
               <w:right w:w="120" w:type="dxa"/>
             </w:tcMar>
           </w:tcPr>
           <w:p>
-            <w:pPr>
-              <w:spacing w:after="0"/>
-            </w:pPr>
             <w:r>
+              <w:rPr>
+                <w:rFonts w:ascii="Arial" w:hAnsi="Arial"/>
+                <w:b/>
+                <w:i w:val="0"/>
+                <w:color w:val="0F172A"/>
+                <w:sz w:val="19"/>
+              </w:rPr>
               <w:t>Supervisor Comments / Feedback:</w:t>
+              <w:br/>
+              <w:br/>
             </w:r>
-          </w:p>
-          <w:p>
-            <w:pPr>
-              <w:spacing w:after="500"/>
-            </w:pPr>
           </w:p>
         </w:tc>
       </w:tr>
       <w:tr>
         <w:tc>
           <w:tcPr>
-            <w:tcW w:type="dxa" w:w="10080"/>
+            <w:tcW w:type="dxa" w:w="9792"/>
+            <w:shd w:fill="FFFFFF"/>
             <w:tcMar>
-              <w:top w:w="80" w:type="dxa"/>
-              <w:bottom w:w="80" w:type="dxa"/>
+              <w:top w:w="70" w:type="dxa"/>
+              <w:bottom w:w="70" w:type="dxa"/>
               <w:left w:w="120" w:type="dxa"/>
               <w:right w:w="120" w:type="dxa"/>
             </w:tcMar>
-            <w:shd w:val="clear" w:color="auto" w:fill="F8FAFC"/>
           </w:tcPr>
           <w:p>
-            <w:pPr>
-              <w:spacing w:after="0"/>
-            </w:pPr>
             <w:r>
+              <w:rPr>
+                <w:rFonts w:ascii="Arial" w:hAnsi="Arial"/>
+                <w:b/>
+                <w:i w:val="0"/>
+                <w:color w:val="0F172A"/>
+                <w:sz w:val="19"/>
+              </w:rPr>
               <w:t>Supervisor Approval Status:   [  ] Satisfactory Progress      [  ] Action Required</w:t>
             </w:r>
           </w:p>
@@ -621,20 +629,27 @@
       <w:tr>
         <w:tc>
           <w:tcPr>
-            <w:tcW w:type="dxa" w:w="10080"/>
+            <w:tcW w:type="dxa" w:w="9792"/>
+            <w:shd w:fill="F8FAFC"/>
             <w:tcMar>
-              <w:top w:w="120" w:type="dxa"/>
-              <w:bottom w:w="120" w:type="dxa"/>
+              <w:top w:w="80" w:type="dxa"/>
+              <w:bottom w:w="80" w:type="dxa"/>
               <w:left w:w="120" w:type="dxa"/>
               <w:right w:w="120" w:type="dxa"/>
             </w:tcMar>
           </w:tcPr>
           <w:p>
-            <w:pPr>
-              <w:spacing w:after="0"/>
-            </w:pPr>
             <w:r>
-              <w:t>Signatures &amp; Date: Student Signature: _______________________    Date: ____________    Supervisor Signature: ____________________    Date: ____________</w:t>
+              <w:rPr>
+                <w:rFonts w:ascii="Arial" w:hAnsi="Arial"/>
+                <w:b w:val="0"/>
+                <w:i w:val="0"/>
+                <w:color w:val="0F172A"/>
+                <w:sz w:val="18"/>
+              </w:rPr>
+              <w:t>Signatures &amp; Date:</w:t>
+              <w:br/>
+              <w:t>Student Signature: _______________________    Date: ____________    Supervisor Signature: ____________________    Date: ____________</w:t>
             </w:r>
           </w:p>
         </w:tc>
@@ -647,37 +662,27 @@
     </w:p>
     <w:p>
       <w:pPr>
-        <w:spacing w:before="0" w:after="40"/>
+        <w:spacing w:after="200"/>
         <w:jc w:val="center"/>
       </w:pPr>
       <w:r>
         <w:rPr>
           <w:rFonts w:ascii="Arial" w:hAnsi="Arial"/>
           <w:b/>
-          <w:sz w:val="24"/>
+          <w:i w:val="0"/>
+          <w:color w:val="0F172A"/>
+          <w:sz w:val="22"/>
         </w:rPr>
-        <w:t>CARDIFF METROPOLITAN UNIVERSITY / ICBT CAMPUS</w:t>
+        <w:t>ICBT CAMPUS - SCHOOL OF COMPUTING</w:t>
         <w:br/>
+        <w:t>SOFTWARE ENGINEERING PROJECT (DISSERTATION) LOG SHEET</w:t>
       </w:r>
-      <w:r>
-        <w:rPr>
-          <w:rFonts w:ascii="Arial" w:hAnsi="Arial"/>
-          <w:b/>
-          <w:color w:val="1E293B"/>
-          <w:sz w:val="21"/>
-        </w:rPr>
-        <w:t>BSc (Hons) in Software Engineering — Project Supervision Log Sheet</w:t>
-      </w:r>
-    </w:p>
-    <w:p>
-      <w:pPr>
-        <w:spacing w:after="80"/>
-      </w:pPr>
     </w:p>
     <w:tbl>
       <w:tblPr>
         <w:tblW w:type="auto" w:w="0"/>
         <w:jc w:val="center"/>
+        <w:tblLayout w:type="fixed"/>
         <w:tblLook w:firstColumn="1" w:firstRow="1" w:lastColumn="0" w:lastRow="0" w:noHBand="0" w:noVBand="1" w:val="04A0"/>
       </w:tblPr>
       <w:tblGrid>
@@ -688,22 +693,21 @@
         <w:tc>
           <w:tcPr>
             <w:tcW w:type="dxa" w:w="2880"/>
-            <w:shd w:val="clear" w:color="auto" w:fill="F1F5F9"/>
+            <w:shd w:fill="1E293B"/>
             <w:tcMar>
-              <w:top w:w="80" w:type="dxa"/>
-              <w:bottom w:w="80" w:type="dxa"/>
+              <w:top w:w="70" w:type="dxa"/>
+              <w:bottom w:w="70" w:type="dxa"/>
               <w:left w:w="120" w:type="dxa"/>
               <w:right w:w="120" w:type="dxa"/>
             </w:tcMar>
           </w:tcPr>
           <w:p>
-            <w:pPr>
-              <w:spacing w:after="0"/>
-            </w:pPr>
             <w:r>
               <w:rPr>
                 <w:rFonts w:ascii="Arial" w:hAnsi="Arial"/>
                 <w:b/>
+                <w:i w:val="0"/>
+                <w:color w:val="FFFFFF"/>
                 <w:sz w:val="19"/>
               </w:rPr>
               <w:t>Student Name &amp; ID:</w:t>
@@ -712,19 +716,24 @@
         </w:tc>
         <w:tc>
           <w:tcPr>
-            <w:tcW w:type="dxa" w:w="7200"/>
+            <w:tcW w:type="dxa" w:w="6912"/>
+            <w:shd w:fill="F8FAFC"/>
             <w:tcMar>
-              <w:top w:w="80" w:type="dxa"/>
-              <w:bottom w:w="80" w:type="dxa"/>
+              <w:top w:w="70" w:type="dxa"/>
+              <w:bottom w:w="70" w:type="dxa"/>
               <w:left w:w="120" w:type="dxa"/>
               <w:right w:w="120" w:type="dxa"/>
             </w:tcMar>
           </w:tcPr>
           <w:p>
-            <w:pPr>
-              <w:spacing w:after="0"/>
-            </w:pPr>
             <w:r>
+              <w:rPr>
+                <w:rFonts w:ascii="Arial" w:hAnsi="Arial"/>
+                <w:b/>
+                <w:i w:val="0"/>
+                <w:color w:val="0F172A"/>
+                <w:sz w:val="19"/>
+              </w:rPr>
               <w:t>Sadeepa Sewmini (Student ID: CB011000)</w:t>
             </w:r>
           </w:p>
@@ -734,22 +743,21 @@
         <w:tc>
           <w:tcPr>
             <w:tcW w:type="dxa" w:w="2880"/>
-            <w:shd w:val="clear" w:color="auto" w:fill="F1F5F9"/>
+            <w:shd w:fill="1E293B"/>
             <w:tcMar>
-              <w:top w:w="80" w:type="dxa"/>
-              <w:bottom w:w="80" w:type="dxa"/>
+              <w:top w:w="70" w:type="dxa"/>
+              <w:bottom w:w="70" w:type="dxa"/>
               <w:left w:w="120" w:type="dxa"/>
               <w:right w:w="120" w:type="dxa"/>
             </w:tcMar>
           </w:tcPr>
           <w:p>
-            <w:pPr>
-              <w:spacing w:after="0"/>
-            </w:pPr>
             <w:r>
               <w:rPr>
                 <w:rFonts w:ascii="Arial" w:hAnsi="Arial"/>
                 <w:b/>
+                <w:i w:val="0"/>
+                <w:color w:val="FFFFFF"/>
                 <w:sz w:val="19"/>
               </w:rPr>
               <w:t>Project Title:</w:t>
@@ -758,19 +766,24 @@
         </w:tc>
         <w:tc>
           <w:tcPr>
-            <w:tcW w:type="dxa" w:w="7200"/>
+            <w:tcW w:type="dxa" w:w="6912"/>
+            <w:shd w:fill="F8FAFC"/>
             <w:tcMar>
-              <w:top w:w="80" w:type="dxa"/>
-              <w:bottom w:w="80" w:type="dxa"/>
+              <w:top w:w="70" w:type="dxa"/>
+              <w:bottom w:w="70" w:type="dxa"/>
               <w:left w:w="120" w:type="dxa"/>
               <w:right w:w="120" w:type="dxa"/>
             </w:tcMar>
           </w:tcPr>
           <w:p>
-            <w:pPr>
-              <w:spacing w:after="0"/>
-            </w:pPr>
             <w:r>
+              <w:rPr>
+                <w:rFonts w:ascii="Arial" w:hAnsi="Arial"/>
+                <w:b/>
+                <w:i w:val="0"/>
+                <w:color w:val="0F172A"/>
+                <w:sz w:val="19"/>
+              </w:rPr>
               <w:t>Safora: AI-Powered Street Crime Prediction, Real-Time Hazard Mapping &amp; Community Emergency Response Platform</w:t>
             </w:r>
           </w:p>
@@ -780,22 +793,21 @@
         <w:tc>
           <w:tcPr>
             <w:tcW w:type="dxa" w:w="2880"/>
-            <w:shd w:val="clear" w:color="auto" w:fill="F1F5F9"/>
+            <w:shd w:fill="1E293B"/>
             <w:tcMar>
-              <w:top w:w="80" w:type="dxa"/>
-              <w:bottom w:w="80" w:type="dxa"/>
+              <w:top w:w="70" w:type="dxa"/>
+              <w:bottom w:w="70" w:type="dxa"/>
               <w:left w:w="120" w:type="dxa"/>
               <w:right w:w="120" w:type="dxa"/>
             </w:tcMar>
           </w:tcPr>
           <w:p>
-            <w:pPr>
-              <w:spacing w:after="0"/>
-            </w:pPr>
             <w:r>
               <w:rPr>
                 <w:rFonts w:ascii="Arial" w:hAnsi="Arial"/>
                 <w:b/>
+                <w:i w:val="0"/>
+                <w:color w:val="FFFFFF"/>
                 <w:sz w:val="19"/>
               </w:rPr>
               <w:t>Supervisor Name:</w:t>
@@ -804,19 +816,24 @@
         </w:tc>
         <w:tc>
           <w:tcPr>
-            <w:tcW w:type="dxa" w:w="7200"/>
+            <w:tcW w:type="dxa" w:w="6912"/>
+            <w:shd w:fill="F8FAFC"/>
             <w:tcMar>
-              <w:top w:w="80" w:type="dxa"/>
-              <w:bottom w:w="80" w:type="dxa"/>
+              <w:top w:w="70" w:type="dxa"/>
+              <w:bottom w:w="70" w:type="dxa"/>
               <w:left w:w="120" w:type="dxa"/>
               <w:right w:w="120" w:type="dxa"/>
             </w:tcMar>
           </w:tcPr>
           <w:p>
-            <w:pPr>
-              <w:spacing w:after="0"/>
-            </w:pPr>
             <w:r>
+              <w:rPr>
+                <w:rFonts w:ascii="Arial" w:hAnsi="Arial"/>
+                <w:b w:val="0"/>
+                <w:i w:val="0"/>
+                <w:color w:val="0F172A"/>
+                <w:sz w:val="19"/>
+              </w:rPr>
               <w:t>Dr. / Mr. Academic Supervisor</w:t>
             </w:r>
           </w:p>
@@ -826,22 +843,21 @@
         <w:tc>
           <w:tcPr>
             <w:tcW w:type="dxa" w:w="2880"/>
-            <w:shd w:val="clear" w:color="auto" w:fill="F1F5F9"/>
+            <w:shd w:fill="1E293B"/>
             <w:tcMar>
-              <w:top w:w="80" w:type="dxa"/>
-              <w:bottom w:w="80" w:type="dxa"/>
+              <w:top w:w="70" w:type="dxa"/>
+              <w:bottom w:w="70" w:type="dxa"/>
               <w:left w:w="120" w:type="dxa"/>
               <w:right w:w="120" w:type="dxa"/>
             </w:tcMar>
           </w:tcPr>
           <w:p>
-            <w:pPr>
-              <w:spacing w:after="0"/>
-            </w:pPr>
             <w:r>
               <w:rPr>
                 <w:rFonts w:ascii="Arial" w:hAnsi="Arial"/>
                 <w:b/>
+                <w:i w:val="0"/>
+                <w:color w:val="FFFFFF"/>
                 <w:sz w:val="19"/>
               </w:rPr>
               <w:t>Module:</w:t>
@@ -850,19 +866,24 @@
         </w:tc>
         <w:tc>
           <w:tcPr>
-            <w:tcW w:type="dxa" w:w="7200"/>
+            <w:tcW w:type="dxa" w:w="6912"/>
+            <w:shd w:fill="F8FAFC"/>
             <w:tcMar>
-              <w:top w:w="80" w:type="dxa"/>
-              <w:bottom w:w="80" w:type="dxa"/>
+              <w:top w:w="70" w:type="dxa"/>
+              <w:bottom w:w="70" w:type="dxa"/>
               <w:left w:w="120" w:type="dxa"/>
               <w:right w:w="120" w:type="dxa"/>
             </w:tcMar>
           </w:tcPr>
           <w:p>
-            <w:pPr>
-              <w:spacing w:after="0"/>
-            </w:pPr>
             <w:r>
+              <w:rPr>
+                <w:rFonts w:ascii="Arial" w:hAnsi="Arial"/>
+                <w:b w:val="0"/>
+                <w:i w:val="0"/>
+                <w:color w:val="0F172A"/>
+                <w:sz w:val="19"/>
+              </w:rPr>
               <w:t>CIS6035 - Software Engineering Project (Dissertation)</w:t>
             </w:r>
           </w:p>
@@ -872,22 +893,21 @@
         <w:tc>
           <w:tcPr>
             <w:tcW w:type="dxa" w:w="2880"/>
-            <w:shd w:val="clear" w:color="auto" w:fill="F1F5F9"/>
+            <w:shd w:fill="1E293B"/>
             <w:tcMar>
-              <w:top w:w="80" w:type="dxa"/>
-              <w:bottom w:w="80" w:type="dxa"/>
+              <w:top w:w="70" w:type="dxa"/>
+              <w:bottom w:w="70" w:type="dxa"/>
               <w:left w:w="120" w:type="dxa"/>
               <w:right w:w="120" w:type="dxa"/>
             </w:tcMar>
           </w:tcPr>
           <w:p>
-            <w:pPr>
-              <w:spacing w:after="0"/>
-            </w:pPr>
             <w:r>
               <w:rPr>
                 <w:rFonts w:ascii="Arial" w:hAnsi="Arial"/>
                 <w:b/>
+                <w:i w:val="0"/>
+                <w:color w:val="FFFFFF"/>
                 <w:sz w:val="19"/>
               </w:rPr>
               <w:t>Meeting Details:</w:t>
@@ -896,19 +916,24 @@
         </w:tc>
         <w:tc>
           <w:tcPr>
-            <w:tcW w:type="dxa" w:w="7200"/>
+            <w:tcW w:type="dxa" w:w="6912"/>
+            <w:shd w:fill="F8FAFC"/>
             <w:tcMar>
-              <w:top w:w="80" w:type="dxa"/>
-              <w:bottom w:w="80" w:type="dxa"/>
+              <w:top w:w="70" w:type="dxa"/>
+              <w:bottom w:w="70" w:type="dxa"/>
               <w:left w:w="120" w:type="dxa"/>
               <w:right w:w="120" w:type="dxa"/>
             </w:tcMar>
           </w:tcPr>
           <w:p>
-            <w:pPr>
-              <w:spacing w:after="0"/>
-            </w:pPr>
             <w:r>
+              <w:rPr>
+                <w:rFonts w:ascii="Arial" w:hAnsi="Arial"/>
+                <w:b/>
+                <w:i w:val="0"/>
+                <w:color w:val="0F172A"/>
+                <w:sz w:val="19"/>
+              </w:rPr>
               <w:t>Meeting No: 02   |   Date: August 09, 2026   |   Time: 11:00 AM - 11:50 AM (50 Minutes)</w:t>
             </w:r>
           </w:p>
@@ -924,6 +949,7 @@
       <w:tblPr>
         <w:tblW w:type="auto" w:w="0"/>
         <w:jc w:val="center"/>
+        <w:tblLayout w:type="fixed"/>
         <w:tblLook w:firstColumn="1" w:firstRow="1" w:lastColumn="0" w:lastRow="0" w:noHBand="0" w:noVBand="1" w:val="04A0"/>
       </w:tblPr>
       <w:tblGrid>
@@ -933,23 +959,22 @@
       <w:tr>
         <w:tc>
           <w:tcPr>
-            <w:tcW w:type="dxa" w:w="3168"/>
-            <w:shd w:val="clear" w:color="auto" w:fill="F8FAFC"/>
+            <w:tcW w:type="dxa" w:w="2880"/>
+            <w:shd w:fill="0F172A"/>
             <w:tcMar>
-              <w:top w:w="100" w:type="dxa"/>
-              <w:bottom w:w="100" w:type="dxa"/>
+              <w:top w:w="80" w:type="dxa"/>
+              <w:bottom w:w="80" w:type="dxa"/>
               <w:left w:w="120" w:type="dxa"/>
               <w:right w:w="120" w:type="dxa"/>
             </w:tcMar>
           </w:tcPr>
           <w:p>
-            <w:pPr>
-              <w:spacing w:after="0"/>
-            </w:pPr>
             <w:r>
               <w:rPr>
                 <w:rFonts w:ascii="Arial" w:hAnsi="Arial"/>
                 <w:b/>
+                <w:i w:val="0"/>
+                <w:color w:val="FFFFFF"/>
                 <w:sz w:val="19"/>
               </w:rPr>
               <w:t>Meeting Mode / Location</w:t>
@@ -959,18 +984,23 @@
         <w:tc>
           <w:tcPr>
             <w:tcW w:type="dxa" w:w="6912"/>
+            <w:shd w:fill="FFFFFF"/>
             <w:tcMar>
-              <w:top w:w="100" w:type="dxa"/>
-              <w:bottom w:w="100" w:type="dxa"/>
+              <w:top w:w="80" w:type="dxa"/>
+              <w:bottom w:w="80" w:type="dxa"/>
               <w:left w:w="120" w:type="dxa"/>
               <w:right w:w="120" w:type="dxa"/>
             </w:tcMar>
           </w:tcPr>
           <w:p>
-            <w:pPr>
-              <w:spacing w:after="0" w:line="276" w:lineRule="auto"/>
-            </w:pPr>
             <w:r>
+              <w:rPr>
+                <w:rFonts w:ascii="Arial" w:hAnsi="Arial"/>
+                <w:b/>
+                <w:i w:val="0"/>
+                <w:color w:val="0F172A"/>
+                <w:sz w:val="18"/>
+              </w:rPr>
               <w:t>In-Person (ICBT Campus)</w:t>
             </w:r>
           </w:p>
@@ -979,23 +1009,22 @@
       <w:tr>
         <w:tc>
           <w:tcPr>
-            <w:tcW w:type="dxa" w:w="3168"/>
-            <w:shd w:val="clear" w:color="auto" w:fill="F8FAFC"/>
+            <w:tcW w:type="dxa" w:w="2880"/>
+            <w:shd w:fill="0F172A"/>
             <w:tcMar>
-              <w:top w:w="100" w:type="dxa"/>
-              <w:bottom w:w="100" w:type="dxa"/>
+              <w:top w:w="80" w:type="dxa"/>
+              <w:bottom w:w="80" w:type="dxa"/>
               <w:left w:w="120" w:type="dxa"/>
               <w:right w:w="120" w:type="dxa"/>
             </w:tcMar>
           </w:tcPr>
           <w:p>
-            <w:pPr>
-              <w:spacing w:after="0"/>
-            </w:pPr>
             <w:r>
               <w:rPr>
                 <w:rFonts w:ascii="Arial" w:hAnsi="Arial"/>
                 <w:b/>
+                <w:i w:val="0"/>
+                <w:color w:val="FFFFFF"/>
                 <w:sz w:val="19"/>
               </w:rPr>
               <w:t>Objectives &amp; Agenda</w:t>
@@ -1005,18 +1034,23 @@
         <w:tc>
           <w:tcPr>
             <w:tcW w:type="dxa" w:w="6912"/>
+            <w:shd w:fill="FFFFFF"/>
             <w:tcMar>
-              <w:top w:w="100" w:type="dxa"/>
-              <w:bottom w:w="100" w:type="dxa"/>
+              <w:top w:w="80" w:type="dxa"/>
+              <w:bottom w:w="80" w:type="dxa"/>
               <w:left w:w="120" w:type="dxa"/>
               <w:right w:w="120" w:type="dxa"/>
             </w:tcMar>
           </w:tcPr>
           <w:p>
-            <w:pPr>
-              <w:spacing w:after="0" w:line="276" w:lineRule="auto"/>
-            </w:pPr>
             <w:r>
+              <w:rPr>
+                <w:rFonts w:ascii="Arial" w:hAnsi="Arial"/>
+                <w:b/>
+                <w:i w:val="0"/>
+                <w:color w:val="0F172A"/>
+                <w:sz w:val="18"/>
+              </w:rPr>
               <w:t>Requirement Analysis Review, System Architecture &amp; Database Design Evaluation.</w:t>
             </w:r>
           </w:p>
@@ -1025,23 +1059,22 @@
       <w:tr>
         <w:tc>
           <w:tcPr>
-            <w:tcW w:type="dxa" w:w="3168"/>
-            <w:shd w:val="clear" w:color="auto" w:fill="F8FAFC"/>
+            <w:tcW w:type="dxa" w:w="2880"/>
+            <w:shd w:fill="0F172A"/>
             <w:tcMar>
-              <w:top w:w="100" w:type="dxa"/>
-              <w:bottom w:w="100" w:type="dxa"/>
+              <w:top w:w="80" w:type="dxa"/>
+              <w:bottom w:w="80" w:type="dxa"/>
               <w:left w:w="120" w:type="dxa"/>
               <w:right w:w="120" w:type="dxa"/>
             </w:tcMar>
           </w:tcPr>
           <w:p>
-            <w:pPr>
-              <w:spacing w:after="0"/>
-            </w:pPr>
             <w:r>
               <w:rPr>
                 <w:rFonts w:ascii="Arial" w:hAnsi="Arial"/>
                 <w:b/>
+                <w:i w:val="0"/>
+                <w:color w:val="FFFFFF"/>
                 <w:sz w:val="19"/>
               </w:rPr>
               <w:t>Discussion Summary &amp; Progress Made</w:t>
@@ -1051,53 +1084,31 @@
         <w:tc>
           <w:tcPr>
             <w:tcW w:type="dxa" w:w="6912"/>
+            <w:shd w:fill="FFFFFF"/>
             <w:tcMar>
-              <w:top w:w="100" w:type="dxa"/>
-              <w:bottom w:w="100" w:type="dxa"/>
+              <w:top w:w="80" w:type="dxa"/>
+              <w:bottom w:w="80" w:type="dxa"/>
               <w:left w:w="120" w:type="dxa"/>
               <w:right w:w="120" w:type="dxa"/>
             </w:tcMar>
           </w:tcPr>
           <w:p>
-            <w:r/>
-          </w:p>
-          <w:p>
-            <w:pPr>
-              <w:spacing w:after="80" w:line="276" w:lineRule="auto"/>
-            </w:pPr>
             <w:r>
-              <w:t>• Presented findings from empirical survey data collected from 150+ commuters and stakeholder feedback.</w:t>
-            </w:r>
-          </w:p>
-          <w:p>
-            <w:pPr>
-              <w:spacing w:after="80" w:line="276" w:lineRule="auto"/>
-            </w:pPr>
-            <w:r>
-              <w:t>• Reviewed functional and non-functional requirements (Real-time reporting, emergency SOS dispatch, safe routing, risk level estimation).</w:t>
-            </w:r>
-          </w:p>
-          <w:p>
-            <w:pPr>
-              <w:spacing w:after="80" w:line="276" w:lineRule="auto"/>
-            </w:pPr>
-            <w:r>
+              <w:rPr>
+                <w:rFonts w:ascii="Arial" w:hAnsi="Arial"/>
+                <w:b w:val="0"/>
+                <w:i w:val="0"/>
+                <w:color w:val="0F172A"/>
+                <w:sz w:val="18"/>
+              </w:rPr>
+              <w:t>• Presented empirical survey data findings collected from 150+ commuters and stakeholder feedback.</w:t>
+              <w:br/>
+              <w:t>• Reviewed functional and non-functional requirements (Real-time reporting, emergency SOS dispatch, safe routing, risk estimation).</w:t>
+              <w:br/>
               <w:t>• Presented system architecture diagrams (Use Case Diagram, 5-Layer System Architecture, and Chen-notation ER Diagram).</w:t>
-            </w:r>
-          </w:p>
-          <w:p>
-            <w:pPr>
-              <w:spacing w:after="80" w:line="276" w:lineRule="auto"/>
-            </w:pPr>
-            <w:r>
+              <w:br/>
               <w:t>• Evaluated the MySQL database schema design including tables for users, incidents, safe_places, sos_requests, alerts, and public_feedbacks.</w:t>
-            </w:r>
-          </w:p>
-          <w:p>
-            <w:pPr>
-              <w:spacing w:after="80" w:line="276" w:lineRule="auto"/>
-            </w:pPr>
-            <w:r>
+              <w:br/>
               <w:t>• Supervisor approved the architectural design and recommended incorporating spatial buffer indexing for route safety calculations.</w:t>
             </w:r>
           </w:p>
@@ -1106,23 +1117,22 @@
       <w:tr>
         <w:tc>
           <w:tcPr>
-            <w:tcW w:type="dxa" w:w="3168"/>
-            <w:shd w:val="clear" w:color="auto" w:fill="F8FAFC"/>
+            <w:tcW w:type="dxa" w:w="2880"/>
+            <w:shd w:fill="0F172A"/>
             <w:tcMar>
-              <w:top w:w="100" w:type="dxa"/>
-              <w:bottom w:w="100" w:type="dxa"/>
+              <w:top w:w="80" w:type="dxa"/>
+              <w:bottom w:w="80" w:type="dxa"/>
               <w:left w:w="120" w:type="dxa"/>
               <w:right w:w="120" w:type="dxa"/>
             </w:tcMar>
           </w:tcPr>
           <w:p>
-            <w:pPr>
-              <w:spacing w:after="0"/>
-            </w:pPr>
             <w:r>
               <w:rPr>
                 <w:rFonts w:ascii="Arial" w:hAnsi="Arial"/>
                 <w:b/>
+                <w:i w:val="0"/>
+                <w:color w:val="FFFFFF"/>
                 <w:sz w:val="19"/>
               </w:rPr>
               <w:t>Action Items &amp; Work Assigned</w:t>
@@ -1132,29 +1142,25 @@
         <w:tc>
           <w:tcPr>
             <w:tcW w:type="dxa" w:w="6912"/>
+            <w:shd w:fill="FFFFFF"/>
             <w:tcMar>
-              <w:top w:w="100" w:type="dxa"/>
-              <w:bottom w:w="100" w:type="dxa"/>
+              <w:top w:w="80" w:type="dxa"/>
+              <w:bottom w:w="80" w:type="dxa"/>
               <w:left w:w="120" w:type="dxa"/>
               <w:right w:w="120" w:type="dxa"/>
             </w:tcMar>
           </w:tcPr>
           <w:p>
-            <w:r/>
-          </w:p>
-          <w:p>
-            <w:pPr>
-              <w:spacing w:after="80" w:line="276" w:lineRule="auto"/>
-            </w:pPr>
             <w:r>
+              <w:rPr>
+                <w:rFonts w:ascii="Arial" w:hAnsi="Arial"/>
+                <w:b w:val="0"/>
+                <w:i w:val="0"/>
+                <w:color w:val="0F172A"/>
+                <w:sz w:val="18"/>
+              </w:rPr>
               <w:t>• Initialize Laravel core framework, database migrations, and authentication middleware.</w:t>
-            </w:r>
-          </w:p>
-          <w:p>
-            <w:pPr>
-              <w:spacing w:after="80" w:line="276" w:lineRule="auto"/>
-            </w:pPr>
-            <w:r>
+              <w:br/>
               <w:t>• Integrate Leaflet.js interactive mapping engine with Nominatim geocoding API.</w:t>
             </w:r>
           </w:p>
@@ -1163,23 +1169,22 @@
       <w:tr>
         <w:tc>
           <w:tcPr>
-            <w:tcW w:type="dxa" w:w="3168"/>
-            <w:shd w:val="clear" w:color="auto" w:fill="F8FAFC"/>
+            <w:tcW w:type="dxa" w:w="2880"/>
+            <w:shd w:fill="0F172A"/>
             <w:tcMar>
-              <w:top w:w="100" w:type="dxa"/>
-              <w:bottom w:w="100" w:type="dxa"/>
+              <w:top w:w="80" w:type="dxa"/>
+              <w:bottom w:w="80" w:type="dxa"/>
               <w:left w:w="120" w:type="dxa"/>
               <w:right w:w="120" w:type="dxa"/>
             </w:tcMar>
           </w:tcPr>
           <w:p>
-            <w:pPr>
-              <w:spacing w:after="0"/>
-            </w:pPr>
             <w:r>
               <w:rPr>
                 <w:rFonts w:ascii="Arial" w:hAnsi="Arial"/>
                 <w:b/>
+                <w:i w:val="0"/>
+                <w:color w:val="FFFFFF"/>
                 <w:sz w:val="19"/>
               </w:rPr>
               <w:t>Target Completion Date</w:t>
@@ -1189,18 +1194,23 @@
         <w:tc>
           <w:tcPr>
             <w:tcW w:type="dxa" w:w="6912"/>
+            <w:shd w:fill="FFFFFF"/>
             <w:tcMar>
-              <w:top w:w="100" w:type="dxa"/>
-              <w:bottom w:w="100" w:type="dxa"/>
+              <w:top w:w="80" w:type="dxa"/>
+              <w:bottom w:w="80" w:type="dxa"/>
               <w:left w:w="120" w:type="dxa"/>
               <w:right w:w="120" w:type="dxa"/>
             </w:tcMar>
           </w:tcPr>
           <w:p>
-            <w:pPr>
-              <w:spacing w:after="0" w:line="276" w:lineRule="auto"/>
-            </w:pPr>
             <w:r>
+              <w:rPr>
+                <w:rFonts w:ascii="Arial" w:hAnsi="Arial"/>
+                <w:b/>
+                <w:i w:val="0"/>
+                <w:color w:val="0F172A"/>
+                <w:sz w:val="18"/>
+              </w:rPr>
               <w:t>August 13, 2026</w:t>
             </w:r>
           </w:p>
@@ -1216,6 +1226,7 @@
       <w:tblPr>
         <w:tblW w:type="auto" w:w="0"/>
         <w:jc w:val="center"/>
+        <w:tblLayout w:type="fixed"/>
         <w:tblLook w:firstColumn="1" w:firstRow="1" w:lastColumn="0" w:lastRow="0" w:noHBand="0" w:noVBand="1" w:val="04A0"/>
       </w:tblPr>
       <w:tblGrid>
@@ -1224,46 +1235,52 @@
       <w:tr>
         <w:tc>
           <w:tcPr>
-            <w:tcW w:type="dxa" w:w="10080"/>
+            <w:tcW w:type="dxa" w:w="9792"/>
+            <w:shd w:fill="F8FAFC"/>
             <w:tcMar>
-              <w:top w:w="100" w:type="dxa"/>
-              <w:bottom w:w="100" w:type="dxa"/>
+              <w:top w:w="80" w:type="dxa"/>
+              <w:bottom w:w="120" w:type="dxa"/>
               <w:left w:w="120" w:type="dxa"/>
               <w:right w:w="120" w:type="dxa"/>
             </w:tcMar>
           </w:tcPr>
           <w:p>
-            <w:pPr>
-              <w:spacing w:after="0"/>
-            </w:pPr>
             <w:r>
+              <w:rPr>
+                <w:rFonts w:ascii="Arial" w:hAnsi="Arial"/>
+                <w:b/>
+                <w:i w:val="0"/>
+                <w:color w:val="0F172A"/>
+                <w:sz w:val="19"/>
+              </w:rPr>
               <w:t>Supervisor Comments / Feedback:</w:t>
+              <w:br/>
+              <w:br/>
             </w:r>
-          </w:p>
-          <w:p>
-            <w:pPr>
-              <w:spacing w:after="500"/>
-            </w:pPr>
           </w:p>
         </w:tc>
       </w:tr>
       <w:tr>
         <w:tc>
           <w:tcPr>
-            <w:tcW w:type="dxa" w:w="10080"/>
+            <w:tcW w:type="dxa" w:w="9792"/>
+            <w:shd w:fill="FFFFFF"/>
             <w:tcMar>
-              <w:top w:w="80" w:type="dxa"/>
-              <w:bottom w:w="80" w:type="dxa"/>
+              <w:top w:w="70" w:type="dxa"/>
+              <w:bottom w:w="70" w:type="dxa"/>
               <w:left w:w="120" w:type="dxa"/>
               <w:right w:w="120" w:type="dxa"/>
             </w:tcMar>
-            <w:shd w:val="clear" w:color="auto" w:fill="F8FAFC"/>
           </w:tcPr>
           <w:p>
-            <w:pPr>
-              <w:spacing w:after="0"/>
-            </w:pPr>
             <w:r>
+              <w:rPr>
+                <w:rFonts w:ascii="Arial" w:hAnsi="Arial"/>
+                <w:b/>
+                <w:i w:val="0"/>
+                <w:color w:val="0F172A"/>
+                <w:sz w:val="19"/>
+              </w:rPr>
               <w:t>Supervisor Approval Status:   [  ] Satisfactory Progress      [  ] Action Required</w:t>
             </w:r>
           </w:p>
@@ -1272,20 +1289,27 @@
       <w:tr>
         <w:tc>
           <w:tcPr>
-            <w:tcW w:type="dxa" w:w="10080"/>
+            <w:tcW w:type="dxa" w:w="9792"/>
+            <w:shd w:fill="F8FAFC"/>
             <w:tcMar>
-              <w:top w:w="120" w:type="dxa"/>
-              <w:bottom w:w="120" w:type="dxa"/>
+              <w:top w:w="80" w:type="dxa"/>
+              <w:bottom w:w="80" w:type="dxa"/>
               <w:left w:w="120" w:type="dxa"/>
               <w:right w:w="120" w:type="dxa"/>
             </w:tcMar>
           </w:tcPr>
           <w:p>
-            <w:pPr>
-              <w:spacing w:after="0"/>
-            </w:pPr>
             <w:r>
-              <w:t>Signatures &amp; Date: Student Signature: _______________________    Date: ____________    Supervisor Signature: ____________________    Date: ____________</w:t>
+              <w:rPr>
+                <w:rFonts w:ascii="Arial" w:hAnsi="Arial"/>
+                <w:b w:val="0"/>
+                <w:i w:val="0"/>
+                <w:color w:val="0F172A"/>
+                <w:sz w:val="18"/>
+              </w:rPr>
+              <w:t>Signatures &amp; Date:</w:t>
+              <w:br/>
+              <w:t>Student Signature: _______________________    Date: ____________    Supervisor Signature: ____________________    Date: ____________</w:t>
             </w:r>
           </w:p>
         </w:tc>
@@ -1298,37 +1322,27 @@
     </w:p>
     <w:p>
       <w:pPr>
-        <w:spacing w:before="0" w:after="40"/>
+        <w:spacing w:after="200"/>
         <w:jc w:val="center"/>
       </w:pPr>
       <w:r>
         <w:rPr>
           <w:rFonts w:ascii="Arial" w:hAnsi="Arial"/>
           <w:b/>
-          <w:sz w:val="24"/>
+          <w:i w:val="0"/>
+          <w:color w:val="0F172A"/>
+          <w:sz w:val="22"/>
         </w:rPr>
-        <w:t>CARDIFF METROPOLITAN UNIVERSITY / ICBT CAMPUS</w:t>
+        <w:t>ICBT CAMPUS - SCHOOL OF COMPUTING</w:t>
         <w:br/>
+        <w:t>SOFTWARE ENGINEERING PROJECT (DISSERTATION) LOG SHEET</w:t>
       </w:r>
-      <w:r>
-        <w:rPr>
-          <w:rFonts w:ascii="Arial" w:hAnsi="Arial"/>
-          <w:b/>
-          <w:color w:val="1E293B"/>
-          <w:sz w:val="21"/>
-        </w:rPr>
-        <w:t>BSc (Hons) in Software Engineering — Project Supervision Log Sheet</w:t>
-      </w:r>
-    </w:p>
-    <w:p>
-      <w:pPr>
-        <w:spacing w:after="80"/>
-      </w:pPr>
     </w:p>
     <w:tbl>
       <w:tblPr>
         <w:tblW w:type="auto" w:w="0"/>
         <w:jc w:val="center"/>
+        <w:tblLayout w:type="fixed"/>
         <w:tblLook w:firstColumn="1" w:firstRow="1" w:lastColumn="0" w:lastRow="0" w:noHBand="0" w:noVBand="1" w:val="04A0"/>
       </w:tblPr>
       <w:tblGrid>
@@ -1339,22 +1353,21 @@
         <w:tc>
           <w:tcPr>
             <w:tcW w:type="dxa" w:w="2880"/>
-            <w:shd w:val="clear" w:color="auto" w:fill="F1F5F9"/>
+            <w:shd w:fill="1E293B"/>
             <w:tcMar>
-              <w:top w:w="80" w:type="dxa"/>
-              <w:bottom w:w="80" w:type="dxa"/>
+              <w:top w:w="70" w:type="dxa"/>
+              <w:bottom w:w="70" w:type="dxa"/>
               <w:left w:w="120" w:type="dxa"/>
               <w:right w:w="120" w:type="dxa"/>
             </w:tcMar>
           </w:tcPr>
           <w:p>
-            <w:pPr>
-              <w:spacing w:after="0"/>
-            </w:pPr>
             <w:r>
               <w:rPr>
                 <w:rFonts w:ascii="Arial" w:hAnsi="Arial"/>
                 <w:b/>
+                <w:i w:val="0"/>
+                <w:color w:val="FFFFFF"/>
                 <w:sz w:val="19"/>
               </w:rPr>
               <w:t>Student Name &amp; ID:</w:t>
@@ -1363,19 +1376,24 @@
         </w:tc>
         <w:tc>
           <w:tcPr>
-            <w:tcW w:type="dxa" w:w="7200"/>
+            <w:tcW w:type="dxa" w:w="6912"/>
+            <w:shd w:fill="F8FAFC"/>
             <w:tcMar>
-              <w:top w:w="80" w:type="dxa"/>
-              <w:bottom w:w="80" w:type="dxa"/>
+              <w:top w:w="70" w:type="dxa"/>
+              <w:bottom w:w="70" w:type="dxa"/>
               <w:left w:w="120" w:type="dxa"/>
               <w:right w:w="120" w:type="dxa"/>
             </w:tcMar>
           </w:tcPr>
           <w:p>
-            <w:pPr>
-              <w:spacing w:after="0"/>
-            </w:pPr>
             <w:r>
+              <w:rPr>
+                <w:rFonts w:ascii="Arial" w:hAnsi="Arial"/>
+                <w:b/>
+                <w:i w:val="0"/>
+                <w:color w:val="0F172A"/>
+                <w:sz w:val="19"/>
+              </w:rPr>
               <w:t>Sadeepa Sewmini (Student ID: CB011000)</w:t>
             </w:r>
           </w:p>
@@ -1385,22 +1403,21 @@
         <w:tc>
           <w:tcPr>
             <w:tcW w:type="dxa" w:w="2880"/>
-            <w:shd w:val="clear" w:color="auto" w:fill="F1F5F9"/>
+            <w:shd w:fill="1E293B"/>
             <w:tcMar>
-              <w:top w:w="80" w:type="dxa"/>
-              <w:bottom w:w="80" w:type="dxa"/>
+              <w:top w:w="70" w:type="dxa"/>
+              <w:bottom w:w="70" w:type="dxa"/>
               <w:left w:w="120" w:type="dxa"/>
               <w:right w:w="120" w:type="dxa"/>
             </w:tcMar>
           </w:tcPr>
           <w:p>
-            <w:pPr>
-              <w:spacing w:after="0"/>
-            </w:pPr>
             <w:r>
               <w:rPr>
                 <w:rFonts w:ascii="Arial" w:hAnsi="Arial"/>
                 <w:b/>
+                <w:i w:val="0"/>
+                <w:color w:val="FFFFFF"/>
                 <w:sz w:val="19"/>
               </w:rPr>
               <w:t>Project Title:</w:t>
@@ -1409,19 +1426,24 @@
         </w:tc>
         <w:tc>
           <w:tcPr>
-            <w:tcW w:type="dxa" w:w="7200"/>
+            <w:tcW w:type="dxa" w:w="6912"/>
+            <w:shd w:fill="F8FAFC"/>
             <w:tcMar>
-              <w:top w:w="80" w:type="dxa"/>
-              <w:bottom w:w="80" w:type="dxa"/>
+              <w:top w:w="70" w:type="dxa"/>
+              <w:bottom w:w="70" w:type="dxa"/>
               <w:left w:w="120" w:type="dxa"/>
               <w:right w:w="120" w:type="dxa"/>
             </w:tcMar>
           </w:tcPr>
           <w:p>
-            <w:pPr>
-              <w:spacing w:after="0"/>
-            </w:pPr>
             <w:r>
+              <w:rPr>
+                <w:rFonts w:ascii="Arial" w:hAnsi="Arial"/>
+                <w:b/>
+                <w:i w:val="0"/>
+                <w:color w:val="0F172A"/>
+                <w:sz w:val="19"/>
+              </w:rPr>
               <w:t>Safora: AI-Powered Street Crime Prediction, Real-Time Hazard Mapping &amp; Community Emergency Response Platform</w:t>
             </w:r>
           </w:p>
@@ -1431,22 +1453,21 @@
         <w:tc>
           <w:tcPr>
             <w:tcW w:type="dxa" w:w="2880"/>
-            <w:shd w:val="clear" w:color="auto" w:fill="F1F5F9"/>
+            <w:shd w:fill="1E293B"/>
             <w:tcMar>
-              <w:top w:w="80" w:type="dxa"/>
-              <w:bottom w:w="80" w:type="dxa"/>
+              <w:top w:w="70" w:type="dxa"/>
+              <w:bottom w:w="70" w:type="dxa"/>
               <w:left w:w="120" w:type="dxa"/>
               <w:right w:w="120" w:type="dxa"/>
             </w:tcMar>
           </w:tcPr>
           <w:p>
-            <w:pPr>
-              <w:spacing w:after="0"/>
-            </w:pPr>
             <w:r>
               <w:rPr>
                 <w:rFonts w:ascii="Arial" w:hAnsi="Arial"/>
                 <w:b/>
+                <w:i w:val="0"/>
+                <w:color w:val="FFFFFF"/>
                 <w:sz w:val="19"/>
               </w:rPr>
               <w:t>Supervisor Name:</w:t>
@@ -1455,19 +1476,24 @@
         </w:tc>
         <w:tc>
           <w:tcPr>
-            <w:tcW w:type="dxa" w:w="7200"/>
+            <w:tcW w:type="dxa" w:w="6912"/>
+            <w:shd w:fill="F8FAFC"/>
             <w:tcMar>
-              <w:top w:w="80" w:type="dxa"/>
-              <w:bottom w:w="80" w:type="dxa"/>
+              <w:top w:w="70" w:type="dxa"/>
+              <w:bottom w:w="70" w:type="dxa"/>
               <w:left w:w="120" w:type="dxa"/>
               <w:right w:w="120" w:type="dxa"/>
             </w:tcMar>
           </w:tcPr>
           <w:p>
-            <w:pPr>
-              <w:spacing w:after="0"/>
-            </w:pPr>
             <w:r>
+              <w:rPr>
+                <w:rFonts w:ascii="Arial" w:hAnsi="Arial"/>
+                <w:b w:val="0"/>
+                <w:i w:val="0"/>
+                <w:color w:val="0F172A"/>
+                <w:sz w:val="19"/>
+              </w:rPr>
               <w:t>Dr. / Mr. Academic Supervisor</w:t>
             </w:r>
           </w:p>
@@ -1477,22 +1503,21 @@
         <w:tc>
           <w:tcPr>
             <w:tcW w:type="dxa" w:w="2880"/>
-            <w:shd w:val="clear" w:color="auto" w:fill="F1F5F9"/>
+            <w:shd w:fill="1E293B"/>
             <w:tcMar>
-              <w:top w:w="80" w:type="dxa"/>
-              <w:bottom w:w="80" w:type="dxa"/>
+              <w:top w:w="70" w:type="dxa"/>
+              <w:bottom w:w="70" w:type="dxa"/>
               <w:left w:w="120" w:type="dxa"/>
               <w:right w:w="120" w:type="dxa"/>
             </w:tcMar>
           </w:tcPr>
           <w:p>
-            <w:pPr>
-              <w:spacing w:after="0"/>
-            </w:pPr>
             <w:r>
               <w:rPr>
                 <w:rFonts w:ascii="Arial" w:hAnsi="Arial"/>
                 <w:b/>
+                <w:i w:val="0"/>
+                <w:color w:val="FFFFFF"/>
                 <w:sz w:val="19"/>
               </w:rPr>
               <w:t>Module:</w:t>
@@ -1501,19 +1526,24 @@
         </w:tc>
         <w:tc>
           <w:tcPr>
-            <w:tcW w:type="dxa" w:w="7200"/>
+            <w:tcW w:type="dxa" w:w="6912"/>
+            <w:shd w:fill="F8FAFC"/>
             <w:tcMar>
-              <w:top w:w="80" w:type="dxa"/>
-              <w:bottom w:w="80" w:type="dxa"/>
+              <w:top w:w="70" w:type="dxa"/>
+              <w:bottom w:w="70" w:type="dxa"/>
               <w:left w:w="120" w:type="dxa"/>
               <w:right w:w="120" w:type="dxa"/>
             </w:tcMar>
           </w:tcPr>
           <w:p>
-            <w:pPr>
-              <w:spacing w:after="0"/>
-            </w:pPr>
             <w:r>
+              <w:rPr>
+                <w:rFonts w:ascii="Arial" w:hAnsi="Arial"/>
+                <w:b w:val="0"/>
+                <w:i w:val="0"/>
+                <w:color w:val="0F172A"/>
+                <w:sz w:val="19"/>
+              </w:rPr>
               <w:t>CIS6035 - Software Engineering Project (Dissertation)</w:t>
             </w:r>
           </w:p>
@@ -1523,22 +1553,21 @@
         <w:tc>
           <w:tcPr>
             <w:tcW w:type="dxa" w:w="2880"/>
-            <w:shd w:val="clear" w:color="auto" w:fill="F1F5F9"/>
+            <w:shd w:fill="1E293B"/>
             <w:tcMar>
-              <w:top w:w="80" w:type="dxa"/>
-              <w:bottom w:w="80" w:type="dxa"/>
+              <w:top w:w="70" w:type="dxa"/>
+              <w:bottom w:w="70" w:type="dxa"/>
               <w:left w:w="120" w:type="dxa"/>
               <w:right w:w="120" w:type="dxa"/>
             </w:tcMar>
           </w:tcPr>
           <w:p>
-            <w:pPr>
-              <w:spacing w:after="0"/>
-            </w:pPr>
             <w:r>
               <w:rPr>
                 <w:rFonts w:ascii="Arial" w:hAnsi="Arial"/>
                 <w:b/>
+                <w:i w:val="0"/>
+                <w:color w:val="FFFFFF"/>
                 <w:sz w:val="19"/>
               </w:rPr>
               <w:t>Meeting Details:</w:t>
@@ -1547,19 +1576,24 @@
         </w:tc>
         <w:tc>
           <w:tcPr>
-            <w:tcW w:type="dxa" w:w="7200"/>
+            <w:tcW w:type="dxa" w:w="6912"/>
+            <w:shd w:fill="F8FAFC"/>
             <w:tcMar>
-              <w:top w:w="80" w:type="dxa"/>
-              <w:bottom w:w="80" w:type="dxa"/>
+              <w:top w:w="70" w:type="dxa"/>
+              <w:bottom w:w="70" w:type="dxa"/>
               <w:left w:w="120" w:type="dxa"/>
               <w:right w:w="120" w:type="dxa"/>
             </w:tcMar>
           </w:tcPr>
           <w:p>
-            <w:pPr>
-              <w:spacing w:after="0"/>
-            </w:pPr>
             <w:r>
+              <w:rPr>
+                <w:rFonts w:ascii="Arial" w:hAnsi="Arial"/>
+                <w:b/>
+                <w:i w:val="0"/>
+                <w:color w:val="0F172A"/>
+                <w:sz w:val="19"/>
+              </w:rPr>
               <w:t>Meeting No: 03   |   Date: August 14, 2026   |   Time: 02:00 PM - 02:45 PM (45 Minutes)</w:t>
             </w:r>
           </w:p>
@@ -1575,6 +1609,7 @@
       <w:tblPr>
         <w:tblW w:type="auto" w:w="0"/>
         <w:jc w:val="center"/>
+        <w:tblLayout w:type="fixed"/>
         <w:tblLook w:firstColumn="1" w:firstRow="1" w:lastColumn="0" w:lastRow="0" w:noHBand="0" w:noVBand="1" w:val="04A0"/>
       </w:tblPr>
       <w:tblGrid>
@@ -1584,23 +1619,22 @@
       <w:tr>
         <w:tc>
           <w:tcPr>
-            <w:tcW w:type="dxa" w:w="3168"/>
-            <w:shd w:val="clear" w:color="auto" w:fill="F8FAFC"/>
+            <w:tcW w:type="dxa" w:w="2880"/>
+            <w:shd w:fill="0F172A"/>
             <w:tcMar>
-              <w:top w:w="100" w:type="dxa"/>
-              <w:bottom w:w="100" w:type="dxa"/>
+              <w:top w:w="80" w:type="dxa"/>
+              <w:bottom w:w="80" w:type="dxa"/>
               <w:left w:w="120" w:type="dxa"/>
               <w:right w:w="120" w:type="dxa"/>
             </w:tcMar>
           </w:tcPr>
           <w:p>
-            <w:pPr>
-              <w:spacing w:after="0"/>
-            </w:pPr>
             <w:r>
               <w:rPr>
                 <w:rFonts w:ascii="Arial" w:hAnsi="Arial"/>
                 <w:b/>
+                <w:i w:val="0"/>
+                <w:color w:val="FFFFFF"/>
                 <w:sz w:val="19"/>
               </w:rPr>
               <w:t>Meeting Mode / Location</w:t>
@@ -1610,18 +1644,23 @@
         <w:tc>
           <w:tcPr>
             <w:tcW w:type="dxa" w:w="6912"/>
+            <w:shd w:fill="FFFFFF"/>
             <w:tcMar>
-              <w:top w:w="100" w:type="dxa"/>
-              <w:bottom w:w="100" w:type="dxa"/>
+              <w:top w:w="80" w:type="dxa"/>
+              <w:bottom w:w="80" w:type="dxa"/>
               <w:left w:w="120" w:type="dxa"/>
               <w:right w:w="120" w:type="dxa"/>
             </w:tcMar>
           </w:tcPr>
           <w:p>
-            <w:pPr>
-              <w:spacing w:after="0" w:line="276" w:lineRule="auto"/>
-            </w:pPr>
             <w:r>
+              <w:rPr>
+                <w:rFonts w:ascii="Arial" w:hAnsi="Arial"/>
+                <w:b/>
+                <w:i w:val="0"/>
+                <w:color w:val="0F172A"/>
+                <w:sz w:val="18"/>
+              </w:rPr>
               <w:t>Online Consultation (MS Teams)</w:t>
             </w:r>
           </w:p>
@@ -1630,23 +1669,22 @@
       <w:tr>
         <w:tc>
           <w:tcPr>
-            <w:tcW w:type="dxa" w:w="3168"/>
-            <w:shd w:val="clear" w:color="auto" w:fill="F8FAFC"/>
+            <w:tcW w:type="dxa" w:w="2880"/>
+            <w:shd w:fill="0F172A"/>
             <w:tcMar>
-              <w:top w:w="100" w:type="dxa"/>
-              <w:bottom w:w="100" w:type="dxa"/>
+              <w:top w:w="80" w:type="dxa"/>
+              <w:bottom w:w="80" w:type="dxa"/>
               <w:left w:w="120" w:type="dxa"/>
               <w:right w:w="120" w:type="dxa"/>
             </w:tcMar>
           </w:tcPr>
           <w:p>
-            <w:pPr>
-              <w:spacing w:after="0"/>
-            </w:pPr>
             <w:r>
               <w:rPr>
                 <w:rFonts w:ascii="Arial" w:hAnsi="Arial"/>
                 <w:b/>
+                <w:i w:val="0"/>
+                <w:color w:val="FFFFFF"/>
                 <w:sz w:val="19"/>
               </w:rPr>
               <w:t>Objectives &amp; Agenda</w:t>
@@ -1656,18 +1694,23 @@
         <w:tc>
           <w:tcPr>
             <w:tcW w:type="dxa" w:w="6912"/>
+            <w:shd w:fill="FFFFFF"/>
             <w:tcMar>
-              <w:top w:w="100" w:type="dxa"/>
-              <w:bottom w:w="100" w:type="dxa"/>
+              <w:top w:w="80" w:type="dxa"/>
+              <w:bottom w:w="80" w:type="dxa"/>
               <w:left w:w="120" w:type="dxa"/>
               <w:right w:w="120" w:type="dxa"/>
             </w:tcMar>
           </w:tcPr>
           <w:p>
-            <w:pPr>
-              <w:spacing w:after="0" w:line="276" w:lineRule="auto"/>
-            </w:pPr>
             <w:r>
+              <w:rPr>
+                <w:rFonts w:ascii="Arial" w:hAnsi="Arial"/>
+                <w:b/>
+                <w:i w:val="0"/>
+                <w:color w:val="0F172A"/>
+                <w:sz w:val="18"/>
+              </w:rPr>
               <w:t>Core System Implementation Review &amp; Interactive Map Navigation Demonstration.</w:t>
             </w:r>
           </w:p>
@@ -1676,23 +1719,22 @@
       <w:tr>
         <w:tc>
           <w:tcPr>
-            <w:tcW w:type="dxa" w:w="3168"/>
-            <w:shd w:val="clear" w:color="auto" w:fill="F8FAFC"/>
+            <w:tcW w:type="dxa" w:w="2880"/>
+            <w:shd w:fill="0F172A"/>
             <w:tcMar>
-              <w:top w:w="100" w:type="dxa"/>
-              <w:bottom w:w="100" w:type="dxa"/>
+              <w:top w:w="80" w:type="dxa"/>
+              <w:bottom w:w="80" w:type="dxa"/>
               <w:left w:w="120" w:type="dxa"/>
               <w:right w:w="120" w:type="dxa"/>
             </w:tcMar>
           </w:tcPr>
           <w:p>
-            <w:pPr>
-              <w:spacing w:after="0"/>
-            </w:pPr>
             <w:r>
               <w:rPr>
                 <w:rFonts w:ascii="Arial" w:hAnsi="Arial"/>
                 <w:b/>
+                <w:i w:val="0"/>
+                <w:color w:val="FFFFFF"/>
                 <w:sz w:val="19"/>
               </w:rPr>
               <w:t>Discussion Summary &amp; Progress Made</w:t>
@@ -1702,53 +1744,31 @@
         <w:tc>
           <w:tcPr>
             <w:tcW w:type="dxa" w:w="6912"/>
+            <w:shd w:fill="FFFFFF"/>
             <w:tcMar>
-              <w:top w:w="100" w:type="dxa"/>
-              <w:bottom w:w="100" w:type="dxa"/>
+              <w:top w:w="80" w:type="dxa"/>
+              <w:bottom w:w="80" w:type="dxa"/>
               <w:left w:w="120" w:type="dxa"/>
               <w:right w:w="120" w:type="dxa"/>
             </w:tcMar>
           </w:tcPr>
           <w:p>
-            <w:r/>
-          </w:p>
-          <w:p>
-            <w:pPr>
-              <w:spacing w:after="80" w:line="276" w:lineRule="auto"/>
-            </w:pPr>
             <w:r>
+              <w:rPr>
+                <w:rFonts w:ascii="Arial" w:hAnsi="Arial"/>
+                <w:b w:val="0"/>
+                <w:i w:val="0"/>
+                <w:color w:val="0F172A"/>
+                <w:sz w:val="18"/>
+              </w:rPr>
               <w:t>• Demonstrated working Laravel application core with role-based access control (Admin, Moderator, Authority, Citizen).</w:t>
-            </w:r>
-          </w:p>
-          <w:p>
-            <w:pPr>
-              <w:spacing w:after="80" w:line="276" w:lineRule="auto"/>
-            </w:pPr>
-            <w:r>
+              <w:br/>
               <w:t>• Showcased Leaflet.js interactive map featuring color-coded hazard markers (Crime, Wildlife, Natural Disasters, Infrastructure).</w:t>
-            </w:r>
-          </w:p>
-          <w:p>
-            <w:pPr>
-              <w:spacing w:after="80" w:line="276" w:lineRule="auto"/>
-            </w:pPr>
-            <w:r>
+              <w:br/>
               <w:t>• Demonstrated verified Safe Places layer (Police Stations, Hospitals, 24/7 Havens) with custom marker icons.</w:t>
-            </w:r>
-          </w:p>
-          <w:p>
-            <w:pPr>
-              <w:spacing w:after="80" w:line="276" w:lineRule="auto"/>
-            </w:pPr>
-            <w:r>
+              <w:br/>
               <w:t>• Reviewed reverse-geocoding integration replacing raw Lat/Long coordinates with human-readable Sri Lankan place names.</w:t>
-            </w:r>
-          </w:p>
-          <w:p>
-            <w:pPr>
-              <w:spacing w:after="80" w:line="276" w:lineRule="auto"/>
-            </w:pPr>
-            <w:r>
+              <w:br/>
               <w:t>• Supervisor provided feedback on enhancing route safety calculations using spatial line-segment corridors instead of bounding boxes.</w:t>
             </w:r>
           </w:p>
@@ -1757,23 +1777,22 @@
       <w:tr>
         <w:tc>
           <w:tcPr>
-            <w:tcW w:type="dxa" w:w="3168"/>
-            <w:shd w:val="clear" w:color="auto" w:fill="F8FAFC"/>
+            <w:tcW w:type="dxa" w:w="2880"/>
+            <w:shd w:fill="0F172A"/>
             <w:tcMar>
-              <w:top w:w="100" w:type="dxa"/>
-              <w:bottom w:w="100" w:type="dxa"/>
+              <w:top w:w="80" w:type="dxa"/>
+              <w:bottom w:w="80" w:type="dxa"/>
               <w:left w:w="120" w:type="dxa"/>
               <w:right w:w="120" w:type="dxa"/>
             </w:tcMar>
           </w:tcPr>
           <w:p>
-            <w:pPr>
-              <w:spacing w:after="0"/>
-            </w:pPr>
             <w:r>
               <w:rPr>
                 <w:rFonts w:ascii="Arial" w:hAnsi="Arial"/>
                 <w:b/>
+                <w:i w:val="0"/>
+                <w:color w:val="FFFFFF"/>
                 <w:sz w:val="19"/>
               </w:rPr>
               <w:t>Action Items &amp; Work Assigned</w:t>
@@ -1783,29 +1802,25 @@
         <w:tc>
           <w:tcPr>
             <w:tcW w:type="dxa" w:w="6912"/>
+            <w:shd w:fill="FFFFFF"/>
             <w:tcMar>
-              <w:top w:w="100" w:type="dxa"/>
-              <w:bottom w:w="100" w:type="dxa"/>
+              <w:top w:w="80" w:type="dxa"/>
+              <w:bottom w:w="80" w:type="dxa"/>
               <w:left w:w="120" w:type="dxa"/>
               <w:right w:w="120" w:type="dxa"/>
             </w:tcMar>
           </w:tcPr>
           <w:p>
-            <w:r/>
-          </w:p>
-          <w:p>
-            <w:pPr>
-              <w:spacing w:after="80" w:line="276" w:lineRule="auto"/>
-            </w:pPr>
             <w:r>
+              <w:rPr>
+                <w:rFonts w:ascii="Arial" w:hAnsi="Arial"/>
+                <w:b w:val="0"/>
+                <w:i w:val="0"/>
+                <w:color w:val="0F172A"/>
+                <w:sz w:val="18"/>
+              </w:rPr>
               <w:t>• Develop Python machine learning pipeline for crime and incident severity risk prediction.</w:t>
-            </w:r>
-          </w:p>
-          <w:p>
-            <w:pPr>
-              <w:spacing w:after="80" w:line="276" w:lineRule="auto"/>
-            </w:pPr>
-            <w:r>
+              <w:br/>
               <w:t>• Refine route calculation engine with 1.2km spatial corridor filtering.</w:t>
             </w:r>
           </w:p>
@@ -1814,23 +1829,22 @@
       <w:tr>
         <w:tc>
           <w:tcPr>
-            <w:tcW w:type="dxa" w:w="3168"/>
-            <w:shd w:val="clear" w:color="auto" w:fill="F8FAFC"/>
+            <w:tcW w:type="dxa" w:w="2880"/>
+            <w:shd w:fill="0F172A"/>
             <w:tcMar>
-              <w:top w:w="100" w:type="dxa"/>
-              <w:bottom w:w="100" w:type="dxa"/>
+              <w:top w:w="80" w:type="dxa"/>
+              <w:bottom w:w="80" w:type="dxa"/>
               <w:left w:w="120" w:type="dxa"/>
               <w:right w:w="120" w:type="dxa"/>
             </w:tcMar>
           </w:tcPr>
           <w:p>
-            <w:pPr>
-              <w:spacing w:after="0"/>
-            </w:pPr>
             <w:r>
               <w:rPr>
                 <w:rFonts w:ascii="Arial" w:hAnsi="Arial"/>
                 <w:b/>
+                <w:i w:val="0"/>
+                <w:color w:val="FFFFFF"/>
                 <w:sz w:val="19"/>
               </w:rPr>
               <w:t>Target Completion Date</w:t>
@@ -1840,18 +1854,23 @@
         <w:tc>
           <w:tcPr>
             <w:tcW w:type="dxa" w:w="6912"/>
+            <w:shd w:fill="FFFFFF"/>
             <w:tcMar>
-              <w:top w:w="100" w:type="dxa"/>
-              <w:bottom w:w="100" w:type="dxa"/>
+              <w:top w:w="80" w:type="dxa"/>
+              <w:bottom w:w="80" w:type="dxa"/>
               <w:left w:w="120" w:type="dxa"/>
               <w:right w:w="120" w:type="dxa"/>
             </w:tcMar>
           </w:tcPr>
           <w:p>
-            <w:pPr>
-              <w:spacing w:after="0" w:line="276" w:lineRule="auto"/>
-            </w:pPr>
             <w:r>
+              <w:rPr>
+                <w:rFonts w:ascii="Arial" w:hAnsi="Arial"/>
+                <w:b/>
+                <w:i w:val="0"/>
+                <w:color w:val="0F172A"/>
+                <w:sz w:val="18"/>
+              </w:rPr>
               <w:t>August 18, 2026</w:t>
             </w:r>
           </w:p>
@@ -1867,6 +1886,7 @@
       <w:tblPr>
         <w:tblW w:type="auto" w:w="0"/>
         <w:jc w:val="center"/>
+        <w:tblLayout w:type="fixed"/>
         <w:tblLook w:firstColumn="1" w:firstRow="1" w:lastColumn="0" w:lastRow="0" w:noHBand="0" w:noVBand="1" w:val="04A0"/>
       </w:tblPr>
       <w:tblGrid>
@@ -1875,46 +1895,52 @@
       <w:tr>
         <w:tc>
           <w:tcPr>
-            <w:tcW w:type="dxa" w:w="10080"/>
+            <w:tcW w:type="dxa" w:w="9792"/>
+            <w:shd w:fill="F8FAFC"/>
             <w:tcMar>
-              <w:top w:w="100" w:type="dxa"/>
-              <w:bottom w:w="100" w:type="dxa"/>
+              <w:top w:w="80" w:type="dxa"/>
+              <w:bottom w:w="120" w:type="dxa"/>
               <w:left w:w="120" w:type="dxa"/>
               <w:right w:w="120" w:type="dxa"/>
             </w:tcMar>
           </w:tcPr>
           <w:p>
-            <w:pPr>
-              <w:spacing w:after="0"/>
-            </w:pPr>
             <w:r>
+              <w:rPr>
+                <w:rFonts w:ascii="Arial" w:hAnsi="Arial"/>
+                <w:b/>
+                <w:i w:val="0"/>
+                <w:color w:val="0F172A"/>
+                <w:sz w:val="19"/>
+              </w:rPr>
               <w:t>Supervisor Comments / Feedback:</w:t>
+              <w:br/>
+              <w:br/>
             </w:r>
-          </w:p>
-          <w:p>
-            <w:pPr>
-              <w:spacing w:after="500"/>
-            </w:pPr>
           </w:p>
         </w:tc>
       </w:tr>
       <w:tr>
         <w:tc>
           <w:tcPr>
-            <w:tcW w:type="dxa" w:w="10080"/>
+            <w:tcW w:type="dxa" w:w="9792"/>
+            <w:shd w:fill="FFFFFF"/>
             <w:tcMar>
-              <w:top w:w="80" w:type="dxa"/>
-              <w:bottom w:w="80" w:type="dxa"/>
+              <w:top w:w="70" w:type="dxa"/>
+              <w:bottom w:w="70" w:type="dxa"/>
               <w:left w:w="120" w:type="dxa"/>
               <w:right w:w="120" w:type="dxa"/>
             </w:tcMar>
-            <w:shd w:val="clear" w:color="auto" w:fill="F8FAFC"/>
           </w:tcPr>
           <w:p>
-            <w:pPr>
-              <w:spacing w:after="0"/>
-            </w:pPr>
             <w:r>
+              <w:rPr>
+                <w:rFonts w:ascii="Arial" w:hAnsi="Arial"/>
+                <w:b/>
+                <w:i w:val="0"/>
+                <w:color w:val="0F172A"/>
+                <w:sz w:val="19"/>
+              </w:rPr>
               <w:t>Supervisor Approval Status:   [  ] Satisfactory Progress      [  ] Action Required</w:t>
             </w:r>
           </w:p>
@@ -1923,20 +1949,27 @@
       <w:tr>
         <w:tc>
           <w:tcPr>
-            <w:tcW w:type="dxa" w:w="10080"/>
+            <w:tcW w:type="dxa" w:w="9792"/>
+            <w:shd w:fill="F8FAFC"/>
             <w:tcMar>
-              <w:top w:w="120" w:type="dxa"/>
-              <w:bottom w:w="120" w:type="dxa"/>
+              <w:top w:w="80" w:type="dxa"/>
+              <w:bottom w:w="80" w:type="dxa"/>
               <w:left w:w="120" w:type="dxa"/>
               <w:right w:w="120" w:type="dxa"/>
             </w:tcMar>
           </w:tcPr>
           <w:p>
-            <w:pPr>
-              <w:spacing w:after="0"/>
-            </w:pPr>
             <w:r>
-              <w:t>Signatures &amp; Date: Student Signature: _______________________    Date: ____________    Supervisor Signature: ____________________    Date: ____________</w:t>
+              <w:rPr>
+                <w:rFonts w:ascii="Arial" w:hAnsi="Arial"/>
+                <w:b w:val="0"/>
+                <w:i w:val="0"/>
+                <w:color w:val="0F172A"/>
+                <w:sz w:val="18"/>
+              </w:rPr>
+              <w:t>Signatures &amp; Date:</w:t>
+              <w:br/>
+              <w:t>Student Signature: _______________________    Date: ____________    Supervisor Signature: ____________________    Date: ____________</w:t>
             </w:r>
           </w:p>
         </w:tc>
@@ -1949,37 +1982,27 @@
     </w:p>
     <w:p>
       <w:pPr>
-        <w:spacing w:before="0" w:after="40"/>
+        <w:spacing w:after="200"/>
         <w:jc w:val="center"/>
       </w:pPr>
       <w:r>
         <w:rPr>
           <w:rFonts w:ascii="Arial" w:hAnsi="Arial"/>
           <w:b/>
-          <w:sz w:val="24"/>
+          <w:i w:val="0"/>
+          <w:color w:val="0F172A"/>
+          <w:sz w:val="22"/>
         </w:rPr>
-        <w:t>CARDIFF METROPOLITAN UNIVERSITY / ICBT CAMPUS</w:t>
+        <w:t>ICBT CAMPUS - SCHOOL OF COMPUTING</w:t>
         <w:br/>
+        <w:t>SOFTWARE ENGINEERING PROJECT (DISSERTATION) LOG SHEET</w:t>
       </w:r>
-      <w:r>
-        <w:rPr>
-          <w:rFonts w:ascii="Arial" w:hAnsi="Arial"/>
-          <w:b/>
-          <w:color w:val="1E293B"/>
-          <w:sz w:val="21"/>
-        </w:rPr>
-        <w:t>BSc (Hons) in Software Engineering — Project Supervision Log Sheet</w:t>
-      </w:r>
-    </w:p>
-    <w:p>
-      <w:pPr>
-        <w:spacing w:after="80"/>
-      </w:pPr>
     </w:p>
     <w:tbl>
       <w:tblPr>
         <w:tblW w:type="auto" w:w="0"/>
         <w:jc w:val="center"/>
+        <w:tblLayout w:type="fixed"/>
         <w:tblLook w:firstColumn="1" w:firstRow="1" w:lastColumn="0" w:lastRow="0" w:noHBand="0" w:noVBand="1" w:val="04A0"/>
       </w:tblPr>
       <w:tblGrid>
@@ -1990,22 +2013,21 @@
         <w:tc>
           <w:tcPr>
             <w:tcW w:type="dxa" w:w="2880"/>
-            <w:shd w:val="clear" w:color="auto" w:fill="F1F5F9"/>
+            <w:shd w:fill="1E293B"/>
             <w:tcMar>
-              <w:top w:w="80" w:type="dxa"/>
-              <w:bottom w:w="80" w:type="dxa"/>
+              <w:top w:w="70" w:type="dxa"/>
+              <w:bottom w:w="70" w:type="dxa"/>
               <w:left w:w="120" w:type="dxa"/>
               <w:right w:w="120" w:type="dxa"/>
             </w:tcMar>
           </w:tcPr>
           <w:p>
-            <w:pPr>
-              <w:spacing w:after="0"/>
-            </w:pPr>
             <w:r>
               <w:rPr>
                 <w:rFonts w:ascii="Arial" w:hAnsi="Arial"/>
                 <w:b/>
+                <w:i w:val="0"/>
+                <w:color w:val="FFFFFF"/>
                 <w:sz w:val="19"/>
               </w:rPr>
               <w:t>Student Name &amp; ID:</w:t>
@@ -2014,19 +2036,24 @@
         </w:tc>
         <w:tc>
           <w:tcPr>
-            <w:tcW w:type="dxa" w:w="7200"/>
+            <w:tcW w:type="dxa" w:w="6912"/>
+            <w:shd w:fill="F8FAFC"/>
             <w:tcMar>
-              <w:top w:w="80" w:type="dxa"/>
-              <w:bottom w:w="80" w:type="dxa"/>
+              <w:top w:w="70" w:type="dxa"/>
+              <w:bottom w:w="70" w:type="dxa"/>
               <w:left w:w="120" w:type="dxa"/>
               <w:right w:w="120" w:type="dxa"/>
             </w:tcMar>
           </w:tcPr>
           <w:p>
-            <w:pPr>
-              <w:spacing w:after="0"/>
-            </w:pPr>
             <w:r>
+              <w:rPr>
+                <w:rFonts w:ascii="Arial" w:hAnsi="Arial"/>
+                <w:b/>
+                <w:i w:val="0"/>
+                <w:color w:val="0F172A"/>
+                <w:sz w:val="19"/>
+              </w:rPr>
               <w:t>Sadeepa Sewmini (Student ID: CB011000)</w:t>
             </w:r>
           </w:p>
@@ -2036,22 +2063,21 @@
         <w:tc>
           <w:tcPr>
             <w:tcW w:type="dxa" w:w="2880"/>
-            <w:shd w:val="clear" w:color="auto" w:fill="F1F5F9"/>
+            <w:shd w:fill="1E293B"/>
             <w:tcMar>
-              <w:top w:w="80" w:type="dxa"/>
-              <w:bottom w:w="80" w:type="dxa"/>
+              <w:top w:w="70" w:type="dxa"/>
+              <w:bottom w:w="70" w:type="dxa"/>
               <w:left w:w="120" w:type="dxa"/>
               <w:right w:w="120" w:type="dxa"/>
             </w:tcMar>
           </w:tcPr>
           <w:p>
-            <w:pPr>
-              <w:spacing w:after="0"/>
-            </w:pPr>
             <w:r>
               <w:rPr>
                 <w:rFonts w:ascii="Arial" w:hAnsi="Arial"/>
                 <w:b/>
+                <w:i w:val="0"/>
+                <w:color w:val="FFFFFF"/>
                 <w:sz w:val="19"/>
               </w:rPr>
               <w:t>Project Title:</w:t>
@@ -2060,19 +2086,24 @@
         </w:tc>
         <w:tc>
           <w:tcPr>
-            <w:tcW w:type="dxa" w:w="7200"/>
+            <w:tcW w:type="dxa" w:w="6912"/>
+            <w:shd w:fill="F8FAFC"/>
             <w:tcMar>
-              <w:top w:w="80" w:type="dxa"/>
-              <w:bottom w:w="80" w:type="dxa"/>
+              <w:top w:w="70" w:type="dxa"/>
+              <w:bottom w:w="70" w:type="dxa"/>
               <w:left w:w="120" w:type="dxa"/>
               <w:right w:w="120" w:type="dxa"/>
             </w:tcMar>
           </w:tcPr>
           <w:p>
-            <w:pPr>
-              <w:spacing w:after="0"/>
-            </w:pPr>
             <w:r>
+              <w:rPr>
+                <w:rFonts w:ascii="Arial" w:hAnsi="Arial"/>
+                <w:b/>
+                <w:i w:val="0"/>
+                <w:color w:val="0F172A"/>
+                <w:sz w:val="19"/>
+              </w:rPr>
               <w:t>Safora: AI-Powered Street Crime Prediction, Real-Time Hazard Mapping &amp; Community Emergency Response Platform</w:t>
             </w:r>
           </w:p>
@@ -2082,22 +2113,21 @@
         <w:tc>
           <w:tcPr>
             <w:tcW w:type="dxa" w:w="2880"/>
-            <w:shd w:val="clear" w:color="auto" w:fill="F1F5F9"/>
+            <w:shd w:fill="1E293B"/>
             <w:tcMar>
-              <w:top w:w="80" w:type="dxa"/>
-              <w:bottom w:w="80" w:type="dxa"/>
+              <w:top w:w="70" w:type="dxa"/>
+              <w:bottom w:w="70" w:type="dxa"/>
               <w:left w:w="120" w:type="dxa"/>
               <w:right w:w="120" w:type="dxa"/>
             </w:tcMar>
           </w:tcPr>
           <w:p>
-            <w:pPr>
-              <w:spacing w:after="0"/>
-            </w:pPr>
             <w:r>
               <w:rPr>
                 <w:rFonts w:ascii="Arial" w:hAnsi="Arial"/>
                 <w:b/>
+                <w:i w:val="0"/>
+                <w:color w:val="FFFFFF"/>
                 <w:sz w:val="19"/>
               </w:rPr>
               <w:t>Supervisor Name:</w:t>
@@ -2106,19 +2136,24 @@
         </w:tc>
         <w:tc>
           <w:tcPr>
-            <w:tcW w:type="dxa" w:w="7200"/>
+            <w:tcW w:type="dxa" w:w="6912"/>
+            <w:shd w:fill="F8FAFC"/>
             <w:tcMar>
-              <w:top w:w="80" w:type="dxa"/>
-              <w:bottom w:w="80" w:type="dxa"/>
+              <w:top w:w="70" w:type="dxa"/>
+              <w:bottom w:w="70" w:type="dxa"/>
               <w:left w:w="120" w:type="dxa"/>
               <w:right w:w="120" w:type="dxa"/>
             </w:tcMar>
           </w:tcPr>
           <w:p>
-            <w:pPr>
-              <w:spacing w:after="0"/>
-            </w:pPr>
             <w:r>
+              <w:rPr>
+                <w:rFonts w:ascii="Arial" w:hAnsi="Arial"/>
+                <w:b w:val="0"/>
+                <w:i w:val="0"/>
+                <w:color w:val="0F172A"/>
+                <w:sz w:val="19"/>
+              </w:rPr>
               <w:t>Dr. / Mr. Academic Supervisor</w:t>
             </w:r>
           </w:p>
@@ -2128,22 +2163,21 @@
         <w:tc>
           <w:tcPr>
             <w:tcW w:type="dxa" w:w="2880"/>
-            <w:shd w:val="clear" w:color="auto" w:fill="F1F5F9"/>
+            <w:shd w:fill="1E293B"/>
             <w:tcMar>
-              <w:top w:w="80" w:type="dxa"/>
-              <w:bottom w:w="80" w:type="dxa"/>
+              <w:top w:w="70" w:type="dxa"/>
+              <w:bottom w:w="70" w:type="dxa"/>
               <w:left w:w="120" w:type="dxa"/>
               <w:right w:w="120" w:type="dxa"/>
             </w:tcMar>
           </w:tcPr>
           <w:p>
-            <w:pPr>
-              <w:spacing w:after="0"/>
-            </w:pPr>
             <w:r>
               <w:rPr>
                 <w:rFonts w:ascii="Arial" w:hAnsi="Arial"/>
                 <w:b/>
+                <w:i w:val="0"/>
+                <w:color w:val="FFFFFF"/>
                 <w:sz w:val="19"/>
               </w:rPr>
               <w:t>Module:</w:t>
@@ -2152,19 +2186,24 @@
         </w:tc>
         <w:tc>
           <w:tcPr>
-            <w:tcW w:type="dxa" w:w="7200"/>
+            <w:tcW w:type="dxa" w:w="6912"/>
+            <w:shd w:fill="F8FAFC"/>
             <w:tcMar>
-              <w:top w:w="80" w:type="dxa"/>
-              <w:bottom w:w="80" w:type="dxa"/>
+              <w:top w:w="70" w:type="dxa"/>
+              <w:bottom w:w="70" w:type="dxa"/>
               <w:left w:w="120" w:type="dxa"/>
               <w:right w:w="120" w:type="dxa"/>
             </w:tcMar>
           </w:tcPr>
           <w:p>
-            <w:pPr>
-              <w:spacing w:after="0"/>
-            </w:pPr>
             <w:r>
+              <w:rPr>
+                <w:rFonts w:ascii="Arial" w:hAnsi="Arial"/>
+                <w:b w:val="0"/>
+                <w:i w:val="0"/>
+                <w:color w:val="0F172A"/>
+                <w:sz w:val="19"/>
+              </w:rPr>
               <w:t>CIS6035 - Software Engineering Project (Dissertation)</w:t>
             </w:r>
           </w:p>
@@ -2174,22 +2213,21 @@
         <w:tc>
           <w:tcPr>
             <w:tcW w:type="dxa" w:w="2880"/>
-            <w:shd w:val="clear" w:color="auto" w:fill="F1F5F9"/>
+            <w:shd w:fill="1E293B"/>
             <w:tcMar>
-              <w:top w:w="80" w:type="dxa"/>
-              <w:bottom w:w="80" w:type="dxa"/>
+              <w:top w:w="70" w:type="dxa"/>
+              <w:bottom w:w="70" w:type="dxa"/>
               <w:left w:w="120" w:type="dxa"/>
               <w:right w:w="120" w:type="dxa"/>
             </w:tcMar>
           </w:tcPr>
           <w:p>
-            <w:pPr>
-              <w:spacing w:after="0"/>
-            </w:pPr>
             <w:r>
               <w:rPr>
                 <w:rFonts w:ascii="Arial" w:hAnsi="Arial"/>
                 <w:b/>
+                <w:i w:val="0"/>
+                <w:color w:val="FFFFFF"/>
                 <w:sz w:val="19"/>
               </w:rPr>
               <w:t>Meeting Details:</w:t>
@@ -2198,19 +2236,24 @@
         </w:tc>
         <w:tc>
           <w:tcPr>
-            <w:tcW w:type="dxa" w:w="7200"/>
+            <w:tcW w:type="dxa" w:w="6912"/>
+            <w:shd w:fill="F8FAFC"/>
             <w:tcMar>
-              <w:top w:w="80" w:type="dxa"/>
-              <w:bottom w:w="80" w:type="dxa"/>
+              <w:top w:w="70" w:type="dxa"/>
+              <w:bottom w:w="70" w:type="dxa"/>
               <w:left w:w="120" w:type="dxa"/>
               <w:right w:w="120" w:type="dxa"/>
             </w:tcMar>
           </w:tcPr>
           <w:p>
-            <w:pPr>
-              <w:spacing w:after="0"/>
-            </w:pPr>
             <w:r>
+              <w:rPr>
+                <w:rFonts w:ascii="Arial" w:hAnsi="Arial"/>
+                <w:b/>
+                <w:i w:val="0"/>
+                <w:color w:val="0F172A"/>
+                <w:sz w:val="19"/>
+              </w:rPr>
               <w:t>Meeting No: 04   |   Date: August 19, 2026   |   Time: 10:30 AM - 11:15 AM (45 Minutes)</w:t>
             </w:r>
           </w:p>
@@ -2226,6 +2269,7 @@
       <w:tblPr>
         <w:tblW w:type="auto" w:w="0"/>
         <w:jc w:val="center"/>
+        <w:tblLayout w:type="fixed"/>
         <w:tblLook w:firstColumn="1" w:firstRow="1" w:lastColumn="0" w:lastRow="0" w:noHBand="0" w:noVBand="1" w:val="04A0"/>
       </w:tblPr>
       <w:tblGrid>
@@ -2235,23 +2279,22 @@
       <w:tr>
         <w:tc>
           <w:tcPr>
-            <w:tcW w:type="dxa" w:w="3168"/>
-            <w:shd w:val="clear" w:color="auto" w:fill="F8FAFC"/>
+            <w:tcW w:type="dxa" w:w="2880"/>
+            <w:shd w:fill="0F172A"/>
             <w:tcMar>
-              <w:top w:w="100" w:type="dxa"/>
-              <w:bottom w:w="100" w:type="dxa"/>
+              <w:top w:w="80" w:type="dxa"/>
+              <w:bottom w:w="80" w:type="dxa"/>
               <w:left w:w="120" w:type="dxa"/>
               <w:right w:w="120" w:type="dxa"/>
             </w:tcMar>
           </w:tcPr>
           <w:p>
-            <w:pPr>
-              <w:spacing w:after="0"/>
-            </w:pPr>
             <w:r>
               <w:rPr>
                 <w:rFonts w:ascii="Arial" w:hAnsi="Arial"/>
                 <w:b/>
+                <w:i w:val="0"/>
+                <w:color w:val="FFFFFF"/>
                 <w:sz w:val="19"/>
               </w:rPr>
               <w:t>Meeting Mode / Location</w:t>
@@ -2261,18 +2304,23 @@
         <w:tc>
           <w:tcPr>
             <w:tcW w:type="dxa" w:w="6912"/>
+            <w:shd w:fill="FFFFFF"/>
             <w:tcMar>
-              <w:top w:w="100" w:type="dxa"/>
-              <w:bottom w:w="100" w:type="dxa"/>
+              <w:top w:w="80" w:type="dxa"/>
+              <w:bottom w:w="80" w:type="dxa"/>
               <w:left w:w="120" w:type="dxa"/>
               <w:right w:w="120" w:type="dxa"/>
             </w:tcMar>
           </w:tcPr>
           <w:p>
-            <w:pPr>
-              <w:spacing w:after="0" w:line="276" w:lineRule="auto"/>
-            </w:pPr>
             <w:r>
+              <w:rPr>
+                <w:rFonts w:ascii="Arial" w:hAnsi="Arial"/>
+                <w:b/>
+                <w:i w:val="0"/>
+                <w:color w:val="0F172A"/>
+                <w:sz w:val="18"/>
+              </w:rPr>
               <w:t>In-Person (ICBT Campus)</w:t>
             </w:r>
           </w:p>
@@ -2281,23 +2329,22 @@
       <w:tr>
         <w:tc>
           <w:tcPr>
-            <w:tcW w:type="dxa" w:w="3168"/>
-            <w:shd w:val="clear" w:color="auto" w:fill="F8FAFC"/>
+            <w:tcW w:type="dxa" w:w="2880"/>
+            <w:shd w:fill="0F172A"/>
             <w:tcMar>
-              <w:top w:w="100" w:type="dxa"/>
-              <w:bottom w:w="100" w:type="dxa"/>
+              <w:top w:w="80" w:type="dxa"/>
+              <w:bottom w:w="80" w:type="dxa"/>
               <w:left w:w="120" w:type="dxa"/>
               <w:right w:w="120" w:type="dxa"/>
             </w:tcMar>
           </w:tcPr>
           <w:p>
-            <w:pPr>
-              <w:spacing w:after="0"/>
-            </w:pPr>
             <w:r>
               <w:rPr>
                 <w:rFonts w:ascii="Arial" w:hAnsi="Arial"/>
                 <w:b/>
+                <w:i w:val="0"/>
+                <w:color w:val="FFFFFF"/>
                 <w:sz w:val="19"/>
               </w:rPr>
               <w:t>Objectives &amp; Agenda</w:t>
@@ -2307,18 +2354,23 @@
         <w:tc>
           <w:tcPr>
             <w:tcW w:type="dxa" w:w="6912"/>
+            <w:shd w:fill="FFFFFF"/>
             <w:tcMar>
-              <w:top w:w="100" w:type="dxa"/>
-              <w:bottom w:w="100" w:type="dxa"/>
+              <w:top w:w="80" w:type="dxa"/>
+              <w:bottom w:w="80" w:type="dxa"/>
               <w:left w:w="120" w:type="dxa"/>
               <w:right w:w="120" w:type="dxa"/>
             </w:tcMar>
           </w:tcPr>
           <w:p>
-            <w:pPr>
-              <w:spacing w:after="0" w:line="276" w:lineRule="auto"/>
-            </w:pPr>
             <w:r>
+              <w:rPr>
+                <w:rFonts w:ascii="Arial" w:hAnsi="Arial"/>
+                <w:b/>
+                <w:i w:val="0"/>
+                <w:color w:val="0F172A"/>
+                <w:sz w:val="18"/>
+              </w:rPr>
               <w:t>AI Prediction Model Integration &amp; Emergency SOS Dispatch Engine Evaluation.</w:t>
             </w:r>
           </w:p>
@@ -2327,23 +2379,22 @@
       <w:tr>
         <w:tc>
           <w:tcPr>
-            <w:tcW w:type="dxa" w:w="3168"/>
-            <w:shd w:val="clear" w:color="auto" w:fill="F8FAFC"/>
+            <w:tcW w:type="dxa" w:w="2880"/>
+            <w:shd w:fill="0F172A"/>
             <w:tcMar>
-              <w:top w:w="100" w:type="dxa"/>
-              <w:bottom w:w="100" w:type="dxa"/>
+              <w:top w:w="80" w:type="dxa"/>
+              <w:bottom w:w="80" w:type="dxa"/>
               <w:left w:w="120" w:type="dxa"/>
               <w:right w:w="120" w:type="dxa"/>
             </w:tcMar>
           </w:tcPr>
           <w:p>
-            <w:pPr>
-              <w:spacing w:after="0"/>
-            </w:pPr>
             <w:r>
               <w:rPr>
                 <w:rFonts w:ascii="Arial" w:hAnsi="Arial"/>
                 <w:b/>
+                <w:i w:val="0"/>
+                <w:color w:val="FFFFFF"/>
                 <w:sz w:val="19"/>
               </w:rPr>
               <w:t>Discussion Summary &amp; Progress Made</w:t>
@@ -2353,45 +2404,29 @@
         <w:tc>
           <w:tcPr>
             <w:tcW w:type="dxa" w:w="6912"/>
+            <w:shd w:fill="FFFFFF"/>
             <w:tcMar>
-              <w:top w:w="100" w:type="dxa"/>
-              <w:bottom w:w="100" w:type="dxa"/>
+              <w:top w:w="80" w:type="dxa"/>
+              <w:bottom w:w="80" w:type="dxa"/>
               <w:left w:w="120" w:type="dxa"/>
               <w:right w:w="120" w:type="dxa"/>
             </w:tcMar>
           </w:tcPr>
           <w:p>
-            <w:r/>
-          </w:p>
-          <w:p>
-            <w:pPr>
-              <w:spacing w:after="80" w:line="276" w:lineRule="auto"/>
-            </w:pPr>
             <w:r>
+              <w:rPr>
+                <w:rFonts w:ascii="Arial" w:hAnsi="Arial"/>
+                <w:b w:val="0"/>
+                <w:i w:val="0"/>
+                <w:color w:val="0F172A"/>
+                <w:sz w:val="18"/>
+              </w:rPr>
               <w:t>• Demonstrated trained Random Forest Machine Learning model for predicting incident severity and area risk scores.</w:t>
-            </w:r>
-          </w:p>
-          <w:p>
-            <w:pPr>
-              <w:spacing w:after="80" w:line="276" w:lineRule="auto"/>
-            </w:pPr>
-            <w:r>
+              <w:br/>
               <w:t>• Presented safe routing algorithm using 1.2km spatial corridor geometry calculation to detect hazards along route polylines.</w:t>
-            </w:r>
-          </w:p>
-          <w:p>
-            <w:pPr>
-              <w:spacing w:after="80" w:line="276" w:lineRule="auto"/>
-            </w:pPr>
-            <w:r>
+              <w:br/>
               <w:t>• Demonstrated Emergency SOS trigger mechanism with instant WhatsApp live GPS location payload generation (https://wa.me/).</w:t>
-            </w:r>
-          </w:p>
-          <w:p>
-            <w:pPr>
-              <w:spacing w:after="80" w:line="276" w:lineRule="auto"/>
-            </w:pPr>
-            <w:r>
+              <w:br/>
               <w:t>• Supervisor commended the spatial corridor accuracy and advised adding visual distance indicators for hazards along proposed routes.</w:t>
             </w:r>
           </w:p>
@@ -2400,23 +2435,22 @@
       <w:tr>
         <w:tc>
           <w:tcPr>
-            <w:tcW w:type="dxa" w:w="3168"/>
-            <w:shd w:val="clear" w:color="auto" w:fill="F8FAFC"/>
+            <w:tcW w:type="dxa" w:w="2880"/>
+            <w:shd w:fill="0F172A"/>
             <w:tcMar>
-              <w:top w:w="100" w:type="dxa"/>
-              <w:bottom w:w="100" w:type="dxa"/>
+              <w:top w:w="80" w:type="dxa"/>
+              <w:bottom w:w="80" w:type="dxa"/>
               <w:left w:w="120" w:type="dxa"/>
               <w:right w:w="120" w:type="dxa"/>
             </w:tcMar>
           </w:tcPr>
           <w:p>
-            <w:pPr>
-              <w:spacing w:after="0"/>
-            </w:pPr>
             <w:r>
               <w:rPr>
                 <w:rFonts w:ascii="Arial" w:hAnsi="Arial"/>
                 <w:b/>
+                <w:i w:val="0"/>
+                <w:color w:val="FFFFFF"/>
                 <w:sz w:val="19"/>
               </w:rPr>
               <w:t>Action Items &amp; Work Assigned</w:t>
@@ -2426,29 +2460,25 @@
         <w:tc>
           <w:tcPr>
             <w:tcW w:type="dxa" w:w="6912"/>
+            <w:shd w:fill="FFFFFF"/>
             <w:tcMar>
-              <w:top w:w="100" w:type="dxa"/>
-              <w:bottom w:w="100" w:type="dxa"/>
+              <w:top w:w="80" w:type="dxa"/>
+              <w:bottom w:w="80" w:type="dxa"/>
               <w:left w:w="120" w:type="dxa"/>
               <w:right w:w="120" w:type="dxa"/>
             </w:tcMar>
           </w:tcPr>
           <w:p>
-            <w:r/>
-          </w:p>
-          <w:p>
-            <w:pPr>
-              <w:spacing w:after="80" w:line="276" w:lineRule="auto"/>
-            </w:pPr>
             <w:r>
+              <w:rPr>
+                <w:rFonts w:ascii="Arial" w:hAnsi="Arial"/>
+                <w:b w:val="0"/>
+                <w:i w:val="0"/>
+                <w:color w:val="0F172A"/>
+                <w:sz w:val="18"/>
+              </w:rPr>
               <w:t>• Implement Night Safety Heatmap showing well-lit street corridors vs unlit areas.</w:t>
-            </w:r>
-          </w:p>
-          <w:p>
-            <w:pPr>
-              <w:spacing w:after="80" w:line="276" w:lineRule="auto"/>
-            </w:pPr>
-            <w:r>
+              <w:br/>
               <w:t>• Develop public feedback review board with MySQL persistence.</w:t>
             </w:r>
           </w:p>
@@ -2457,23 +2487,22 @@
       <w:tr>
         <w:tc>
           <w:tcPr>
-            <w:tcW w:type="dxa" w:w="3168"/>
-            <w:shd w:val="clear" w:color="auto" w:fill="F8FAFC"/>
+            <w:tcW w:type="dxa" w:w="2880"/>
+            <w:shd w:fill="0F172A"/>
             <w:tcMar>
-              <w:top w:w="100" w:type="dxa"/>
-              <w:bottom w:w="100" w:type="dxa"/>
+              <w:top w:w="80" w:type="dxa"/>
+              <w:bottom w:w="80" w:type="dxa"/>
               <w:left w:w="120" w:type="dxa"/>
               <w:right w:w="120" w:type="dxa"/>
             </w:tcMar>
           </w:tcPr>
           <w:p>
-            <w:pPr>
-              <w:spacing w:after="0"/>
-            </w:pPr>
             <w:r>
               <w:rPr>
                 <w:rFonts w:ascii="Arial" w:hAnsi="Arial"/>
                 <w:b/>
+                <w:i w:val="0"/>
+                <w:color w:val="FFFFFF"/>
                 <w:sz w:val="19"/>
               </w:rPr>
               <w:t>Target Completion Date</w:t>
@@ -2483,18 +2512,23 @@
         <w:tc>
           <w:tcPr>
             <w:tcW w:type="dxa" w:w="6912"/>
+            <w:shd w:fill="FFFFFF"/>
             <w:tcMar>
-              <w:top w:w="100" w:type="dxa"/>
-              <w:bottom w:w="100" w:type="dxa"/>
+              <w:top w:w="80" w:type="dxa"/>
+              <w:bottom w:w="80" w:type="dxa"/>
               <w:left w:w="120" w:type="dxa"/>
               <w:right w:w="120" w:type="dxa"/>
             </w:tcMar>
           </w:tcPr>
           <w:p>
-            <w:pPr>
-              <w:spacing w:after="0" w:line="276" w:lineRule="auto"/>
-            </w:pPr>
             <w:r>
+              <w:rPr>
+                <w:rFonts w:ascii="Arial" w:hAnsi="Arial"/>
+                <w:b/>
+                <w:i w:val="0"/>
+                <w:color w:val="0F172A"/>
+                <w:sz w:val="18"/>
+              </w:rPr>
               <w:t>August 23, 2026</w:t>
             </w:r>
           </w:p>
@@ -2510,6 +2544,7 @@
       <w:tblPr>
         <w:tblW w:type="auto" w:w="0"/>
         <w:jc w:val="center"/>
+        <w:tblLayout w:type="fixed"/>
         <w:tblLook w:firstColumn="1" w:firstRow="1" w:lastColumn="0" w:lastRow="0" w:noHBand="0" w:noVBand="1" w:val="04A0"/>
       </w:tblPr>
       <w:tblGrid>
@@ -2518,46 +2553,52 @@
       <w:tr>
         <w:tc>
           <w:tcPr>
-            <w:tcW w:type="dxa" w:w="10080"/>
+            <w:tcW w:type="dxa" w:w="9792"/>
+            <w:shd w:fill="F8FAFC"/>
             <w:tcMar>
-              <w:top w:w="100" w:type="dxa"/>
-              <w:bottom w:w="100" w:type="dxa"/>
+              <w:top w:w="80" w:type="dxa"/>
+              <w:bottom w:w="120" w:type="dxa"/>
               <w:left w:w="120" w:type="dxa"/>
               <w:right w:w="120" w:type="dxa"/>
             </w:tcMar>
           </w:tcPr>
           <w:p>
-            <w:pPr>
-              <w:spacing w:after="0"/>
-            </w:pPr>
             <w:r>
+              <w:rPr>
+                <w:rFonts w:ascii="Arial" w:hAnsi="Arial"/>
+                <w:b/>
+                <w:i w:val="0"/>
+                <w:color w:val="0F172A"/>
+                <w:sz w:val="19"/>
+              </w:rPr>
               <w:t>Supervisor Comments / Feedback:</w:t>
+              <w:br/>
+              <w:br/>
             </w:r>
-          </w:p>
-          <w:p>
-            <w:pPr>
-              <w:spacing w:after="500"/>
-            </w:pPr>
           </w:p>
         </w:tc>
       </w:tr>
       <w:tr>
         <w:tc>
           <w:tcPr>
-            <w:tcW w:type="dxa" w:w="10080"/>
+            <w:tcW w:type="dxa" w:w="9792"/>
+            <w:shd w:fill="FFFFFF"/>
             <w:tcMar>
-              <w:top w:w="80" w:type="dxa"/>
-              <w:bottom w:w="80" w:type="dxa"/>
+              <w:top w:w="70" w:type="dxa"/>
+              <w:bottom w:w="70" w:type="dxa"/>
               <w:left w:w="120" w:type="dxa"/>
               <w:right w:w="120" w:type="dxa"/>
             </w:tcMar>
-            <w:shd w:val="clear" w:color="auto" w:fill="F8FAFC"/>
           </w:tcPr>
           <w:p>
-            <w:pPr>
-              <w:spacing w:after="0"/>
-            </w:pPr>
             <w:r>
+              <w:rPr>
+                <w:rFonts w:ascii="Arial" w:hAnsi="Arial"/>
+                <w:b/>
+                <w:i w:val="0"/>
+                <w:color w:val="0F172A"/>
+                <w:sz w:val="19"/>
+              </w:rPr>
               <w:t>Supervisor Approval Status:   [  ] Satisfactory Progress      [  ] Action Required</w:t>
             </w:r>
           </w:p>
@@ -2566,20 +2607,27 @@
       <w:tr>
         <w:tc>
           <w:tcPr>
-            <w:tcW w:type="dxa" w:w="10080"/>
+            <w:tcW w:type="dxa" w:w="9792"/>
+            <w:shd w:fill="F8FAFC"/>
             <w:tcMar>
-              <w:top w:w="120" w:type="dxa"/>
-              <w:bottom w:w="120" w:type="dxa"/>
+              <w:top w:w="80" w:type="dxa"/>
+              <w:bottom w:w="80" w:type="dxa"/>
               <w:left w:w="120" w:type="dxa"/>
               <w:right w:w="120" w:type="dxa"/>
             </w:tcMar>
           </w:tcPr>
           <w:p>
-            <w:pPr>
-              <w:spacing w:after="0"/>
-            </w:pPr>
             <w:r>
-              <w:t>Signatures &amp; Date: Student Signature: _______________________    Date: ____________    Supervisor Signature: ____________________    Date: ____________</w:t>
+              <w:rPr>
+                <w:rFonts w:ascii="Arial" w:hAnsi="Arial"/>
+                <w:b w:val="0"/>
+                <w:i w:val="0"/>
+                <w:color w:val="0F172A"/>
+                <w:sz w:val="18"/>
+              </w:rPr>
+              <w:t>Signatures &amp; Date:</w:t>
+              <w:br/>
+              <w:t>Student Signature: _______________________    Date: ____________    Supervisor Signature: ____________________    Date: ____________</w:t>
             </w:r>
           </w:p>
         </w:tc>
@@ -2592,37 +2640,27 @@
     </w:p>
     <w:p>
       <w:pPr>
-        <w:spacing w:before="0" w:after="40"/>
+        <w:spacing w:after="200"/>
         <w:jc w:val="center"/>
       </w:pPr>
       <w:r>
         <w:rPr>
           <w:rFonts w:ascii="Arial" w:hAnsi="Arial"/>
           <w:b/>
-          <w:sz w:val="24"/>
+          <w:i w:val="0"/>
+          <w:color w:val="0F172A"/>
+          <w:sz w:val="22"/>
         </w:rPr>
-        <w:t>CARDIFF METROPOLITAN UNIVERSITY / ICBT CAMPUS</w:t>
+        <w:t>ICBT CAMPUS - SCHOOL OF COMPUTING</w:t>
         <w:br/>
+        <w:t>SOFTWARE ENGINEERING PROJECT (DISSERTATION) LOG SHEET</w:t>
       </w:r>
-      <w:r>
-        <w:rPr>
-          <w:rFonts w:ascii="Arial" w:hAnsi="Arial"/>
-          <w:b/>
-          <w:color w:val="1E293B"/>
-          <w:sz w:val="21"/>
-        </w:rPr>
-        <w:t>BSc (Hons) in Software Engineering — Project Supervision Log Sheet</w:t>
-      </w:r>
-    </w:p>
-    <w:p>
-      <w:pPr>
-        <w:spacing w:after="80"/>
-      </w:pPr>
     </w:p>
     <w:tbl>
       <w:tblPr>
         <w:tblW w:type="auto" w:w="0"/>
         <w:jc w:val="center"/>
+        <w:tblLayout w:type="fixed"/>
         <w:tblLook w:firstColumn="1" w:firstRow="1" w:lastColumn="0" w:lastRow="0" w:noHBand="0" w:noVBand="1" w:val="04A0"/>
       </w:tblPr>
       <w:tblGrid>
@@ -2633,22 +2671,21 @@
         <w:tc>
           <w:tcPr>
             <w:tcW w:type="dxa" w:w="2880"/>
-            <w:shd w:val="clear" w:color="auto" w:fill="F1F5F9"/>
+            <w:shd w:fill="1E293B"/>
             <w:tcMar>
-              <w:top w:w="80" w:type="dxa"/>
-              <w:bottom w:w="80" w:type="dxa"/>
+              <w:top w:w="70" w:type="dxa"/>
+              <w:bottom w:w="70" w:type="dxa"/>
               <w:left w:w="120" w:type="dxa"/>
               <w:right w:w="120" w:type="dxa"/>
             </w:tcMar>
           </w:tcPr>
           <w:p>
-            <w:pPr>
-              <w:spacing w:after="0"/>
-            </w:pPr>
             <w:r>
               <w:rPr>
                 <w:rFonts w:ascii="Arial" w:hAnsi="Arial"/>
                 <w:b/>
+                <w:i w:val="0"/>
+                <w:color w:val="FFFFFF"/>
                 <w:sz w:val="19"/>
               </w:rPr>
               <w:t>Student Name &amp; ID:</w:t>
@@ -2657,19 +2694,24 @@
         </w:tc>
         <w:tc>
           <w:tcPr>
-            <w:tcW w:type="dxa" w:w="7200"/>
+            <w:tcW w:type="dxa" w:w="6912"/>
+            <w:shd w:fill="F8FAFC"/>
             <w:tcMar>
-              <w:top w:w="80" w:type="dxa"/>
-              <w:bottom w:w="80" w:type="dxa"/>
+              <w:top w:w="70" w:type="dxa"/>
+              <w:bottom w:w="70" w:type="dxa"/>
               <w:left w:w="120" w:type="dxa"/>
               <w:right w:w="120" w:type="dxa"/>
             </w:tcMar>
           </w:tcPr>
           <w:p>
-            <w:pPr>
-              <w:spacing w:after="0"/>
-            </w:pPr>
             <w:r>
+              <w:rPr>
+                <w:rFonts w:ascii="Arial" w:hAnsi="Arial"/>
+                <w:b/>
+                <w:i w:val="0"/>
+                <w:color w:val="0F172A"/>
+                <w:sz w:val="19"/>
+              </w:rPr>
               <w:t>Sadeepa Sewmini (Student ID: CB011000)</w:t>
             </w:r>
           </w:p>
@@ -2679,22 +2721,21 @@
         <w:tc>
           <w:tcPr>
             <w:tcW w:type="dxa" w:w="2880"/>
-            <w:shd w:val="clear" w:color="auto" w:fill="F1F5F9"/>
+            <w:shd w:fill="1E293B"/>
             <w:tcMar>
-              <w:top w:w="80" w:type="dxa"/>
-              <w:bottom w:w="80" w:type="dxa"/>
+              <w:top w:w="70" w:type="dxa"/>
+              <w:bottom w:w="70" w:type="dxa"/>
               <w:left w:w="120" w:type="dxa"/>
               <w:right w:w="120" w:type="dxa"/>
             </w:tcMar>
           </w:tcPr>
           <w:p>
-            <w:pPr>
-              <w:spacing w:after="0"/>
-            </w:pPr>
             <w:r>
               <w:rPr>
                 <w:rFonts w:ascii="Arial" w:hAnsi="Arial"/>
                 <w:b/>
+                <w:i w:val="0"/>
+                <w:color w:val="FFFFFF"/>
                 <w:sz w:val="19"/>
               </w:rPr>
               <w:t>Project Title:</w:t>
@@ -2703,19 +2744,24 @@
         </w:tc>
         <w:tc>
           <w:tcPr>
-            <w:tcW w:type="dxa" w:w="7200"/>
+            <w:tcW w:type="dxa" w:w="6912"/>
+            <w:shd w:fill="F8FAFC"/>
             <w:tcMar>
-              <w:top w:w="80" w:type="dxa"/>
-              <w:bottom w:w="80" w:type="dxa"/>
+              <w:top w:w="70" w:type="dxa"/>
+              <w:bottom w:w="70" w:type="dxa"/>
               <w:left w:w="120" w:type="dxa"/>
               <w:right w:w="120" w:type="dxa"/>
             </w:tcMar>
           </w:tcPr>
           <w:p>
-            <w:pPr>
-              <w:spacing w:after="0"/>
-            </w:pPr>
             <w:r>
+              <w:rPr>
+                <w:rFonts w:ascii="Arial" w:hAnsi="Arial"/>
+                <w:b/>
+                <w:i w:val="0"/>
+                <w:color w:val="0F172A"/>
+                <w:sz w:val="19"/>
+              </w:rPr>
               <w:t>Safora: AI-Powered Street Crime Prediction, Real-Time Hazard Mapping &amp; Community Emergency Response Platform</w:t>
             </w:r>
           </w:p>
@@ -2725,22 +2771,21 @@
         <w:tc>
           <w:tcPr>
             <w:tcW w:type="dxa" w:w="2880"/>
-            <w:shd w:val="clear" w:color="auto" w:fill="F1F5F9"/>
+            <w:shd w:fill="1E293B"/>
             <w:tcMar>
-              <w:top w:w="80" w:type="dxa"/>
-              <w:bottom w:w="80" w:type="dxa"/>
+              <w:top w:w="70" w:type="dxa"/>
+              <w:bottom w:w="70" w:type="dxa"/>
               <w:left w:w="120" w:type="dxa"/>
               <w:right w:w="120" w:type="dxa"/>
             </w:tcMar>
           </w:tcPr>
           <w:p>
-            <w:pPr>
-              <w:spacing w:after="0"/>
-            </w:pPr>
             <w:r>
               <w:rPr>
                 <w:rFonts w:ascii="Arial" w:hAnsi="Arial"/>
                 <w:b/>
+                <w:i w:val="0"/>
+                <w:color w:val="FFFFFF"/>
                 <w:sz w:val="19"/>
               </w:rPr>
               <w:t>Supervisor Name:</w:t>
@@ -2749,19 +2794,24 @@
         </w:tc>
         <w:tc>
           <w:tcPr>
-            <w:tcW w:type="dxa" w:w="7200"/>
+            <w:tcW w:type="dxa" w:w="6912"/>
+            <w:shd w:fill="F8FAFC"/>
             <w:tcMar>
-              <w:top w:w="80" w:type="dxa"/>
-              <w:bottom w:w="80" w:type="dxa"/>
+              <w:top w:w="70" w:type="dxa"/>
+              <w:bottom w:w="70" w:type="dxa"/>
               <w:left w:w="120" w:type="dxa"/>
               <w:right w:w="120" w:type="dxa"/>
             </w:tcMar>
           </w:tcPr>
           <w:p>
-            <w:pPr>
-              <w:spacing w:after="0"/>
-            </w:pPr>
             <w:r>
+              <w:rPr>
+                <w:rFonts w:ascii="Arial" w:hAnsi="Arial"/>
+                <w:b w:val="0"/>
+                <w:i w:val="0"/>
+                <w:color w:val="0F172A"/>
+                <w:sz w:val="19"/>
+              </w:rPr>
               <w:t>Dr. / Mr. Academic Supervisor</w:t>
             </w:r>
           </w:p>
@@ -2771,22 +2821,21 @@
         <w:tc>
           <w:tcPr>
             <w:tcW w:type="dxa" w:w="2880"/>
-            <w:shd w:val="clear" w:color="auto" w:fill="F1F5F9"/>
+            <w:shd w:fill="1E293B"/>
             <w:tcMar>
-              <w:top w:w="80" w:type="dxa"/>
-              <w:bottom w:w="80" w:type="dxa"/>
+              <w:top w:w="70" w:type="dxa"/>
+              <w:bottom w:w="70" w:type="dxa"/>
               <w:left w:w="120" w:type="dxa"/>
               <w:right w:w="120" w:type="dxa"/>
             </w:tcMar>
           </w:tcPr>
           <w:p>
-            <w:pPr>
-              <w:spacing w:after="0"/>
-            </w:pPr>
             <w:r>
               <w:rPr>
                 <w:rFonts w:ascii="Arial" w:hAnsi="Arial"/>
                 <w:b/>
+                <w:i w:val="0"/>
+                <w:color w:val="FFFFFF"/>
                 <w:sz w:val="19"/>
               </w:rPr>
               <w:t>Module:</w:t>
@@ -2795,19 +2844,24 @@
         </w:tc>
         <w:tc>
           <w:tcPr>
-            <w:tcW w:type="dxa" w:w="7200"/>
+            <w:tcW w:type="dxa" w:w="6912"/>
+            <w:shd w:fill="F8FAFC"/>
             <w:tcMar>
-              <w:top w:w="80" w:type="dxa"/>
-              <w:bottom w:w="80" w:type="dxa"/>
+              <w:top w:w="70" w:type="dxa"/>
+              <w:bottom w:w="70" w:type="dxa"/>
               <w:left w:w="120" w:type="dxa"/>
               <w:right w:w="120" w:type="dxa"/>
             </w:tcMar>
           </w:tcPr>
           <w:p>
-            <w:pPr>
-              <w:spacing w:after="0"/>
-            </w:pPr>
             <w:r>
+              <w:rPr>
+                <w:rFonts w:ascii="Arial" w:hAnsi="Arial"/>
+                <w:b w:val="0"/>
+                <w:i w:val="0"/>
+                <w:color w:val="0F172A"/>
+                <w:sz w:val="19"/>
+              </w:rPr>
               <w:t>CIS6035 - Software Engineering Project (Dissertation)</w:t>
             </w:r>
           </w:p>
@@ -2817,22 +2871,21 @@
         <w:tc>
           <w:tcPr>
             <w:tcW w:type="dxa" w:w="2880"/>
-            <w:shd w:val="clear" w:color="auto" w:fill="F1F5F9"/>
+            <w:shd w:fill="1E293B"/>
             <w:tcMar>
-              <w:top w:w="80" w:type="dxa"/>
-              <w:bottom w:w="80" w:type="dxa"/>
+              <w:top w:w="70" w:type="dxa"/>
+              <w:bottom w:w="70" w:type="dxa"/>
               <w:left w:w="120" w:type="dxa"/>
               <w:right w:w="120" w:type="dxa"/>
             </w:tcMar>
           </w:tcPr>
           <w:p>
-            <w:pPr>
-              <w:spacing w:after="0"/>
-            </w:pPr>
             <w:r>
               <w:rPr>
                 <w:rFonts w:ascii="Arial" w:hAnsi="Arial"/>
                 <w:b/>
+                <w:i w:val="0"/>
+                <w:color w:val="FFFFFF"/>
                 <w:sz w:val="19"/>
               </w:rPr>
               <w:t>Meeting Details:</w:t>
@@ -2841,19 +2894,24 @@
         </w:tc>
         <w:tc>
           <w:tcPr>
-            <w:tcW w:type="dxa" w:w="7200"/>
+            <w:tcW w:type="dxa" w:w="6912"/>
+            <w:shd w:fill="F8FAFC"/>
             <w:tcMar>
-              <w:top w:w="80" w:type="dxa"/>
-              <w:bottom w:w="80" w:type="dxa"/>
+              <w:top w:w="70" w:type="dxa"/>
+              <w:bottom w:w="70" w:type="dxa"/>
               <w:left w:w="120" w:type="dxa"/>
               <w:right w:w="120" w:type="dxa"/>
             </w:tcMar>
           </w:tcPr>
           <w:p>
-            <w:pPr>
-              <w:spacing w:after="0"/>
-            </w:pPr>
             <w:r>
+              <w:rPr>
+                <w:rFonts w:ascii="Arial" w:hAnsi="Arial"/>
+                <w:b/>
+                <w:i w:val="0"/>
+                <w:color w:val="0F172A"/>
+                <w:sz w:val="19"/>
+              </w:rPr>
               <w:t>Meeting No: 05   |   Date: August 24, 2026   |   Time: 03:00 PM - 03:50 PM (50 Minutes)</w:t>
             </w:r>
           </w:p>
@@ -2869,6 +2927,7 @@
       <w:tblPr>
         <w:tblW w:type="auto" w:w="0"/>
         <w:jc w:val="center"/>
+        <w:tblLayout w:type="fixed"/>
         <w:tblLook w:firstColumn="1" w:firstRow="1" w:lastColumn="0" w:lastRow="0" w:noHBand="0" w:noVBand="1" w:val="04A0"/>
       </w:tblPr>
       <w:tblGrid>
@@ -2878,23 +2937,22 @@
       <w:tr>
         <w:tc>
           <w:tcPr>
-            <w:tcW w:type="dxa" w:w="3168"/>
-            <w:shd w:val="clear" w:color="auto" w:fill="F8FAFC"/>
+            <w:tcW w:type="dxa" w:w="2880"/>
+            <w:shd w:fill="0F172A"/>
             <w:tcMar>
-              <w:top w:w="100" w:type="dxa"/>
-              <w:bottom w:w="100" w:type="dxa"/>
+              <w:top w:w="80" w:type="dxa"/>
+              <w:bottom w:w="80" w:type="dxa"/>
               <w:left w:w="120" w:type="dxa"/>
               <w:right w:w="120" w:type="dxa"/>
             </w:tcMar>
           </w:tcPr>
           <w:p>
-            <w:pPr>
-              <w:spacing w:after="0"/>
-            </w:pPr>
             <w:r>
               <w:rPr>
                 <w:rFonts w:ascii="Arial" w:hAnsi="Arial"/>
                 <w:b/>
+                <w:i w:val="0"/>
+                <w:color w:val="FFFFFF"/>
                 <w:sz w:val="19"/>
               </w:rPr>
               <w:t>Meeting Mode / Location</w:t>
@@ -2904,18 +2962,23 @@
         <w:tc>
           <w:tcPr>
             <w:tcW w:type="dxa" w:w="6912"/>
+            <w:shd w:fill="FFFFFF"/>
             <w:tcMar>
-              <w:top w:w="100" w:type="dxa"/>
-              <w:bottom w:w="100" w:type="dxa"/>
+              <w:top w:w="80" w:type="dxa"/>
+              <w:bottom w:w="80" w:type="dxa"/>
               <w:left w:w="120" w:type="dxa"/>
               <w:right w:w="120" w:type="dxa"/>
             </w:tcMar>
           </w:tcPr>
           <w:p>
-            <w:pPr>
-              <w:spacing w:after="0" w:line="276" w:lineRule="auto"/>
-            </w:pPr>
             <w:r>
+              <w:rPr>
+                <w:rFonts w:ascii="Arial" w:hAnsi="Arial"/>
+                <w:b/>
+                <w:i w:val="0"/>
+                <w:color w:val="0F172A"/>
+                <w:sz w:val="18"/>
+              </w:rPr>
               <w:t>Online Consultation (MS Teams)</w:t>
             </w:r>
           </w:p>
@@ -2924,23 +2987,22 @@
       <w:tr>
         <w:tc>
           <w:tcPr>
-            <w:tcW w:type="dxa" w:w="3168"/>
-            <w:shd w:val="clear" w:color="auto" w:fill="F8FAFC"/>
+            <w:tcW w:type="dxa" w:w="2880"/>
+            <w:shd w:fill="0F172A"/>
             <w:tcMar>
-              <w:top w:w="100" w:type="dxa"/>
-              <w:bottom w:w="100" w:type="dxa"/>
+              <w:top w:w="80" w:type="dxa"/>
+              <w:bottom w:w="80" w:type="dxa"/>
               <w:left w:w="120" w:type="dxa"/>
               <w:right w:w="120" w:type="dxa"/>
             </w:tcMar>
           </w:tcPr>
           <w:p>
-            <w:pPr>
-              <w:spacing w:after="0"/>
-            </w:pPr>
             <w:r>
               <w:rPr>
                 <w:rFonts w:ascii="Arial" w:hAnsi="Arial"/>
                 <w:b/>
+                <w:i w:val="0"/>
+                <w:color w:val="FFFFFF"/>
                 <w:sz w:val="19"/>
               </w:rPr>
               <w:t>Objectives &amp; Agenda</w:t>
@@ -2950,18 +3012,23 @@
         <w:tc>
           <w:tcPr>
             <w:tcW w:type="dxa" w:w="6912"/>
+            <w:shd w:fill="FFFFFF"/>
             <w:tcMar>
-              <w:top w:w="100" w:type="dxa"/>
-              <w:bottom w:w="100" w:type="dxa"/>
+              <w:top w:w="80" w:type="dxa"/>
+              <w:bottom w:w="80" w:type="dxa"/>
               <w:left w:w="120" w:type="dxa"/>
               <w:right w:w="120" w:type="dxa"/>
             </w:tcMar>
           </w:tcPr>
           <w:p>
-            <w:pPr>
-              <w:spacing w:after="0" w:line="276" w:lineRule="auto"/>
-            </w:pPr>
             <w:r>
+              <w:rPr>
+                <w:rFonts w:ascii="Arial" w:hAnsi="Arial"/>
+                <w:b/>
+                <w:i w:val="0"/>
+                <w:color w:val="0F172A"/>
+                <w:sz w:val="18"/>
+              </w:rPr>
               <w:t>Advanced UI/UX Features, Night Safety Corridors &amp; System Integration Testing.</w:t>
             </w:r>
           </w:p>
@@ -2970,23 +3037,22 @@
       <w:tr>
         <w:tc>
           <w:tcPr>
-            <w:tcW w:type="dxa" w:w="3168"/>
-            <w:shd w:val="clear" w:color="auto" w:fill="F8FAFC"/>
+            <w:tcW w:type="dxa" w:w="2880"/>
+            <w:shd w:fill="0F172A"/>
             <w:tcMar>
-              <w:top w:w="100" w:type="dxa"/>
-              <w:bottom w:w="100" w:type="dxa"/>
+              <w:top w:w="80" w:type="dxa"/>
+              <w:bottom w:w="80" w:type="dxa"/>
               <w:left w:w="120" w:type="dxa"/>
               <w:right w:w="120" w:type="dxa"/>
             </w:tcMar>
           </w:tcPr>
           <w:p>
-            <w:pPr>
-              <w:spacing w:after="0"/>
-            </w:pPr>
             <w:r>
               <w:rPr>
                 <w:rFonts w:ascii="Arial" w:hAnsi="Arial"/>
                 <w:b/>
+                <w:i w:val="0"/>
+                <w:color w:val="FFFFFF"/>
                 <w:sz w:val="19"/>
               </w:rPr>
               <w:t>Discussion Summary &amp; Progress Made</w:t>
@@ -2996,53 +3062,31 @@
         <w:tc>
           <w:tcPr>
             <w:tcW w:type="dxa" w:w="6912"/>
+            <w:shd w:fill="FFFFFF"/>
             <w:tcMar>
-              <w:top w:w="100" w:type="dxa"/>
-              <w:bottom w:w="100" w:type="dxa"/>
+              <w:top w:w="80" w:type="dxa"/>
+              <w:bottom w:w="80" w:type="dxa"/>
               <w:left w:w="120" w:type="dxa"/>
               <w:right w:w="120" w:type="dxa"/>
             </w:tcMar>
           </w:tcPr>
           <w:p>
-            <w:r/>
-          </w:p>
-          <w:p>
-            <w:pPr>
-              <w:spacing w:after="80" w:line="276" w:lineRule="auto"/>
-            </w:pPr>
             <w:r>
+              <w:rPr>
+                <w:rFonts w:ascii="Arial" w:hAnsi="Arial"/>
+                <w:b w:val="0"/>
+                <w:i w:val="0"/>
+                <w:color w:val="0F172A"/>
+                <w:sz w:val="18"/>
+              </w:rPr>
               <w:t>• Demonstrated Night Safety Heatmap displaying illuminated safe travel corridors.</w:t>
-            </w:r>
-          </w:p>
-          <w:p>
-            <w:pPr>
-              <w:spacing w:after="80" w:line="276" w:lineRule="auto"/>
-            </w:pPr>
-            <w:r>
+              <w:br/>
               <w:t>• Showcased Community Review &amp; Feedback Carousel with dynamic 2-card pairing and MySQL database persistence.</w:t>
-            </w:r>
-          </w:p>
-          <w:p>
-            <w:pPr>
-              <w:spacing w:after="80" w:line="276" w:lineRule="auto"/>
-            </w:pPr>
-            <w:r>
+              <w:br/>
               <w:t>• Demonstrated Safora AI Safety Companion Chatbot integrated with Google Gemini API and local emergency knowledge fallbacks.</w:t>
-            </w:r>
-          </w:p>
-          <w:p>
-            <w:pPr>
-              <w:spacing w:after="80" w:line="276" w:lineRule="auto"/>
-            </w:pPr>
-            <w:r>
+              <w:br/>
               <w:t>• Reviewed security controls, CSRF protection, role middleware, and SQL injection prevention measures.</w:t>
-            </w:r>
-          </w:p>
-          <w:p>
-            <w:pPr>
-              <w:spacing w:after="80" w:line="276" w:lineRule="auto"/>
-            </w:pPr>
-            <w:r>
+              <w:br/>
               <w:t>• Supervisor expressed satisfaction with full system integration and instructed starting final dissertation chapter writing and benchmarking.</w:t>
             </w:r>
           </w:p>
@@ -3051,23 +3095,22 @@
       <w:tr>
         <w:tc>
           <w:tcPr>
-            <w:tcW w:type="dxa" w:w="3168"/>
-            <w:shd w:val="clear" w:color="auto" w:fill="F8FAFC"/>
+            <w:tcW w:type="dxa" w:w="2880"/>
+            <w:shd w:fill="0F172A"/>
             <w:tcMar>
-              <w:top w:w="100" w:type="dxa"/>
-              <w:bottom w:w="100" w:type="dxa"/>
+              <w:top w:w="80" w:type="dxa"/>
+              <w:bottom w:w="80" w:type="dxa"/>
               <w:left w:w="120" w:type="dxa"/>
               <w:right w:w="120" w:type="dxa"/>
             </w:tcMar>
           </w:tcPr>
           <w:p>
-            <w:pPr>
-              <w:spacing w:after="0"/>
-            </w:pPr>
             <w:r>
               <w:rPr>
                 <w:rFonts w:ascii="Arial" w:hAnsi="Arial"/>
                 <w:b/>
+                <w:i w:val="0"/>
+                <w:color w:val="FFFFFF"/>
                 <w:sz w:val="19"/>
               </w:rPr>
               <w:t>Action Items &amp; Work Assigned</w:t>
@@ -3077,29 +3120,25 @@
         <w:tc>
           <w:tcPr>
             <w:tcW w:type="dxa" w:w="6912"/>
+            <w:shd w:fill="FFFFFF"/>
             <w:tcMar>
-              <w:top w:w="100" w:type="dxa"/>
-              <w:bottom w:w="100" w:type="dxa"/>
+              <w:top w:w="80" w:type="dxa"/>
+              <w:bottom w:w="80" w:type="dxa"/>
               <w:left w:w="120" w:type="dxa"/>
               <w:right w:w="120" w:type="dxa"/>
             </w:tcMar>
           </w:tcPr>
           <w:p>
-            <w:r/>
-          </w:p>
-          <w:p>
-            <w:pPr>
-              <w:spacing w:after="80" w:line="276" w:lineRule="auto"/>
-            </w:pPr>
             <w:r>
+              <w:rPr>
+                <w:rFonts w:ascii="Arial" w:hAnsi="Arial"/>
+                <w:b w:val="0"/>
+                <w:i w:val="0"/>
+                <w:color w:val="0F172A"/>
+                <w:sz w:val="18"/>
+              </w:rPr>
               <w:t>• Complete Chapter 5 (Implementation) and Chapter 6 (Testing &amp; Evaluation) of dissertation.</w:t>
-            </w:r>
-          </w:p>
-          <w:p>
-            <w:pPr>
-              <w:spacing w:after="80" w:line="276" w:lineRule="auto"/>
-            </w:pPr>
-            <w:r>
+              <w:br/>
               <w:t>• Perform system response time and accuracy benchmarking.</w:t>
             </w:r>
           </w:p>
@@ -3108,23 +3147,22 @@
       <w:tr>
         <w:tc>
           <w:tcPr>
-            <w:tcW w:type="dxa" w:w="3168"/>
-            <w:shd w:val="clear" w:color="auto" w:fill="F8FAFC"/>
+            <w:tcW w:type="dxa" w:w="2880"/>
+            <w:shd w:fill="0F172A"/>
             <w:tcMar>
-              <w:top w:w="100" w:type="dxa"/>
-              <w:bottom w:w="100" w:type="dxa"/>
+              <w:top w:w="80" w:type="dxa"/>
+              <w:bottom w:w="80" w:type="dxa"/>
               <w:left w:w="120" w:type="dxa"/>
               <w:right w:w="120" w:type="dxa"/>
             </w:tcMar>
           </w:tcPr>
           <w:p>
-            <w:pPr>
-              <w:spacing w:after="0"/>
-            </w:pPr>
             <w:r>
               <w:rPr>
                 <w:rFonts w:ascii="Arial" w:hAnsi="Arial"/>
                 <w:b/>
+                <w:i w:val="0"/>
+                <w:color w:val="FFFFFF"/>
                 <w:sz w:val="19"/>
               </w:rPr>
               <w:t>Target Completion Date</w:t>
@@ -3134,18 +3172,23 @@
         <w:tc>
           <w:tcPr>
             <w:tcW w:type="dxa" w:w="6912"/>
+            <w:shd w:fill="FFFFFF"/>
             <w:tcMar>
-              <w:top w:w="100" w:type="dxa"/>
-              <w:bottom w:w="100" w:type="dxa"/>
+              <w:top w:w="80" w:type="dxa"/>
+              <w:bottom w:w="80" w:type="dxa"/>
               <w:left w:w="120" w:type="dxa"/>
               <w:right w:w="120" w:type="dxa"/>
             </w:tcMar>
           </w:tcPr>
           <w:p>
-            <w:pPr>
-              <w:spacing w:after="0" w:line="276" w:lineRule="auto"/>
-            </w:pPr>
             <w:r>
+              <w:rPr>
+                <w:rFonts w:ascii="Arial" w:hAnsi="Arial"/>
+                <w:b/>
+                <w:i w:val="0"/>
+                <w:color w:val="0F172A"/>
+                <w:sz w:val="18"/>
+              </w:rPr>
               <w:t>August 27, 2026</w:t>
             </w:r>
           </w:p>
@@ -3161,6 +3204,7 @@
       <w:tblPr>
         <w:tblW w:type="auto" w:w="0"/>
         <w:jc w:val="center"/>
+        <w:tblLayout w:type="fixed"/>
         <w:tblLook w:firstColumn="1" w:firstRow="1" w:lastColumn="0" w:lastRow="0" w:noHBand="0" w:noVBand="1" w:val="04A0"/>
       </w:tblPr>
       <w:tblGrid>
@@ -3169,46 +3213,52 @@
       <w:tr>
         <w:tc>
           <w:tcPr>
-            <w:tcW w:type="dxa" w:w="10080"/>
+            <w:tcW w:type="dxa" w:w="9792"/>
+            <w:shd w:fill="F8FAFC"/>
             <w:tcMar>
-              <w:top w:w="100" w:type="dxa"/>
-              <w:bottom w:w="100" w:type="dxa"/>
+              <w:top w:w="80" w:type="dxa"/>
+              <w:bottom w:w="120" w:type="dxa"/>
               <w:left w:w="120" w:type="dxa"/>
               <w:right w:w="120" w:type="dxa"/>
             </w:tcMar>
           </w:tcPr>
           <w:p>
-            <w:pPr>
-              <w:spacing w:after="0"/>
-            </w:pPr>
             <w:r>
+              <w:rPr>
+                <w:rFonts w:ascii="Arial" w:hAnsi="Arial"/>
+                <w:b/>
+                <w:i w:val="0"/>
+                <w:color w:val="0F172A"/>
+                <w:sz w:val="19"/>
+              </w:rPr>
               <w:t>Supervisor Comments / Feedback:</w:t>
+              <w:br/>
+              <w:br/>
             </w:r>
-          </w:p>
-          <w:p>
-            <w:pPr>
-              <w:spacing w:after="500"/>
-            </w:pPr>
           </w:p>
         </w:tc>
       </w:tr>
       <w:tr>
         <w:tc>
           <w:tcPr>
-            <w:tcW w:type="dxa" w:w="10080"/>
+            <w:tcW w:type="dxa" w:w="9792"/>
+            <w:shd w:fill="FFFFFF"/>
             <w:tcMar>
-              <w:top w:w="80" w:type="dxa"/>
-              <w:bottom w:w="80" w:type="dxa"/>
+              <w:top w:w="70" w:type="dxa"/>
+              <w:bottom w:w="70" w:type="dxa"/>
               <w:left w:w="120" w:type="dxa"/>
               <w:right w:w="120" w:type="dxa"/>
             </w:tcMar>
-            <w:shd w:val="clear" w:color="auto" w:fill="F8FAFC"/>
           </w:tcPr>
           <w:p>
-            <w:pPr>
-              <w:spacing w:after="0"/>
-            </w:pPr>
             <w:r>
+              <w:rPr>
+                <w:rFonts w:ascii="Arial" w:hAnsi="Arial"/>
+                <w:b/>
+                <w:i w:val="0"/>
+                <w:color w:val="0F172A"/>
+                <w:sz w:val="19"/>
+              </w:rPr>
               <w:t>Supervisor Approval Status:   [  ] Satisfactory Progress      [  ] Action Required</w:t>
             </w:r>
           </w:p>
@@ -3217,20 +3267,27 @@
       <w:tr>
         <w:tc>
           <w:tcPr>
-            <w:tcW w:type="dxa" w:w="10080"/>
+            <w:tcW w:type="dxa" w:w="9792"/>
+            <w:shd w:fill="F8FAFC"/>
             <w:tcMar>
-              <w:top w:w="120" w:type="dxa"/>
-              <w:bottom w:w="120" w:type="dxa"/>
+              <w:top w:w="80" w:type="dxa"/>
+              <w:bottom w:w="80" w:type="dxa"/>
               <w:left w:w="120" w:type="dxa"/>
               <w:right w:w="120" w:type="dxa"/>
             </w:tcMar>
           </w:tcPr>
           <w:p>
-            <w:pPr>
-              <w:spacing w:after="0"/>
-            </w:pPr>
             <w:r>
-              <w:t>Signatures &amp; Date: Student Signature: _______________________    Date: ____________    Supervisor Signature: ____________________    Date: ____________</w:t>
+              <w:rPr>
+                <w:rFonts w:ascii="Arial" w:hAnsi="Arial"/>
+                <w:b w:val="0"/>
+                <w:i w:val="0"/>
+                <w:color w:val="0F172A"/>
+                <w:sz w:val="18"/>
+              </w:rPr>
+              <w:t>Signatures &amp; Date:</w:t>
+              <w:br/>
+              <w:t>Student Signature: _______________________    Date: ____________    Supervisor Signature: ____________________    Date: ____________</w:t>
             </w:r>
           </w:p>
         </w:tc>
@@ -3243,37 +3300,27 @@
     </w:p>
     <w:p>
       <w:pPr>
-        <w:spacing w:before="0" w:after="40"/>
+        <w:spacing w:after="200"/>
         <w:jc w:val="center"/>
       </w:pPr>
       <w:r>
         <w:rPr>
           <w:rFonts w:ascii="Arial" w:hAnsi="Arial"/>
           <w:b/>
-          <w:sz w:val="24"/>
+          <w:i w:val="0"/>
+          <w:color w:val="0F172A"/>
+          <w:sz w:val="22"/>
         </w:rPr>
-        <w:t>CARDIFF METROPOLITAN UNIVERSITY / ICBT CAMPUS</w:t>
+        <w:t>ICBT CAMPUS - SCHOOL OF COMPUTING</w:t>
         <w:br/>
+        <w:t>SOFTWARE ENGINEERING PROJECT (DISSERTATION) LOG SHEET</w:t>
       </w:r>
-      <w:r>
-        <w:rPr>
-          <w:rFonts w:ascii="Arial" w:hAnsi="Arial"/>
-          <w:b/>
-          <w:color w:val="1E293B"/>
-          <w:sz w:val="21"/>
-        </w:rPr>
-        <w:t>BSc (Hons) in Software Engineering — Project Supervision Log Sheet</w:t>
-      </w:r>
-    </w:p>
-    <w:p>
-      <w:pPr>
-        <w:spacing w:after="80"/>
-      </w:pPr>
     </w:p>
     <w:tbl>
       <w:tblPr>
         <w:tblW w:type="auto" w:w="0"/>
         <w:jc w:val="center"/>
+        <w:tblLayout w:type="fixed"/>
         <w:tblLook w:firstColumn="1" w:firstRow="1" w:lastColumn="0" w:lastRow="0" w:noHBand="0" w:noVBand="1" w:val="04A0"/>
       </w:tblPr>
       <w:tblGrid>
@@ -3284,22 +3331,21 @@
         <w:tc>
           <w:tcPr>
             <w:tcW w:type="dxa" w:w="2880"/>
-            <w:shd w:val="clear" w:color="auto" w:fill="F1F5F9"/>
+            <w:shd w:fill="1E293B"/>
             <w:tcMar>
-              <w:top w:w="80" w:type="dxa"/>
-              <w:bottom w:w="80" w:type="dxa"/>
+              <w:top w:w="70" w:type="dxa"/>
+              <w:bottom w:w="70" w:type="dxa"/>
               <w:left w:w="120" w:type="dxa"/>
               <w:right w:w="120" w:type="dxa"/>
             </w:tcMar>
           </w:tcPr>
           <w:p>
-            <w:pPr>
-              <w:spacing w:after="0"/>
-            </w:pPr>
             <w:r>
               <w:rPr>
                 <w:rFonts w:ascii="Arial" w:hAnsi="Arial"/>
                 <w:b/>
+                <w:i w:val="0"/>
+                <w:color w:val="FFFFFF"/>
                 <w:sz w:val="19"/>
               </w:rPr>
               <w:t>Student Name &amp; ID:</w:t>
@@ -3308,19 +3354,24 @@
         </w:tc>
         <w:tc>
           <w:tcPr>
-            <w:tcW w:type="dxa" w:w="7200"/>
+            <w:tcW w:type="dxa" w:w="6912"/>
+            <w:shd w:fill="F8FAFC"/>
             <w:tcMar>
-              <w:top w:w="80" w:type="dxa"/>
-              <w:bottom w:w="80" w:type="dxa"/>
+              <w:top w:w="70" w:type="dxa"/>
+              <w:bottom w:w="70" w:type="dxa"/>
               <w:left w:w="120" w:type="dxa"/>
               <w:right w:w="120" w:type="dxa"/>
             </w:tcMar>
           </w:tcPr>
           <w:p>
-            <w:pPr>
-              <w:spacing w:after="0"/>
-            </w:pPr>
             <w:r>
+              <w:rPr>
+                <w:rFonts w:ascii="Arial" w:hAnsi="Arial"/>
+                <w:b/>
+                <w:i w:val="0"/>
+                <w:color w:val="0F172A"/>
+                <w:sz w:val="19"/>
+              </w:rPr>
               <w:t>Sadeepa Sewmini (Student ID: CB011000)</w:t>
             </w:r>
           </w:p>
@@ -3330,22 +3381,21 @@
         <w:tc>
           <w:tcPr>
             <w:tcW w:type="dxa" w:w="2880"/>
-            <w:shd w:val="clear" w:color="auto" w:fill="F1F5F9"/>
+            <w:shd w:fill="1E293B"/>
             <w:tcMar>
-              <w:top w:w="80" w:type="dxa"/>
-              <w:bottom w:w="80" w:type="dxa"/>
+              <w:top w:w="70" w:type="dxa"/>
+              <w:bottom w:w="70" w:type="dxa"/>
               <w:left w:w="120" w:type="dxa"/>
               <w:right w:w="120" w:type="dxa"/>
             </w:tcMar>
           </w:tcPr>
           <w:p>
-            <w:pPr>
-              <w:spacing w:after="0"/>
-            </w:pPr>
             <w:r>
               <w:rPr>
                 <w:rFonts w:ascii="Arial" w:hAnsi="Arial"/>
                 <w:b/>
+                <w:i w:val="0"/>
+                <w:color w:val="FFFFFF"/>
                 <w:sz w:val="19"/>
               </w:rPr>
               <w:t>Project Title:</w:t>
@@ -3354,19 +3404,24 @@
         </w:tc>
         <w:tc>
           <w:tcPr>
-            <w:tcW w:type="dxa" w:w="7200"/>
+            <w:tcW w:type="dxa" w:w="6912"/>
+            <w:shd w:fill="F8FAFC"/>
             <w:tcMar>
-              <w:top w:w="80" w:type="dxa"/>
-              <w:bottom w:w="80" w:type="dxa"/>
+              <w:top w:w="70" w:type="dxa"/>
+              <w:bottom w:w="70" w:type="dxa"/>
               <w:left w:w="120" w:type="dxa"/>
               <w:right w:w="120" w:type="dxa"/>
             </w:tcMar>
           </w:tcPr>
           <w:p>
-            <w:pPr>
-              <w:spacing w:after="0"/>
-            </w:pPr>
             <w:r>
+              <w:rPr>
+                <w:rFonts w:ascii="Arial" w:hAnsi="Arial"/>
+                <w:b/>
+                <w:i w:val="0"/>
+                <w:color w:val="0F172A"/>
+                <w:sz w:val="19"/>
+              </w:rPr>
               <w:t>Safora: AI-Powered Street Crime Prediction, Real-Time Hazard Mapping &amp; Community Emergency Response Platform</w:t>
             </w:r>
           </w:p>
@@ -3376,22 +3431,21 @@
         <w:tc>
           <w:tcPr>
             <w:tcW w:type="dxa" w:w="2880"/>
-            <w:shd w:val="clear" w:color="auto" w:fill="F1F5F9"/>
+            <w:shd w:fill="1E293B"/>
             <w:tcMar>
-              <w:top w:w="80" w:type="dxa"/>
-              <w:bottom w:w="80" w:type="dxa"/>
+              <w:top w:w="70" w:type="dxa"/>
+              <w:bottom w:w="70" w:type="dxa"/>
               <w:left w:w="120" w:type="dxa"/>
               <w:right w:w="120" w:type="dxa"/>
             </w:tcMar>
           </w:tcPr>
           <w:p>
-            <w:pPr>
-              <w:spacing w:after="0"/>
-            </w:pPr>
             <w:r>
               <w:rPr>
                 <w:rFonts w:ascii="Arial" w:hAnsi="Arial"/>
                 <w:b/>
+                <w:i w:val="0"/>
+                <w:color w:val="FFFFFF"/>
                 <w:sz w:val="19"/>
               </w:rPr>
               <w:t>Supervisor Name:</w:t>
@@ -3400,19 +3454,24 @@
         </w:tc>
         <w:tc>
           <w:tcPr>
-            <w:tcW w:type="dxa" w:w="7200"/>
+            <w:tcW w:type="dxa" w:w="6912"/>
+            <w:shd w:fill="F8FAFC"/>
             <w:tcMar>
-              <w:top w:w="80" w:type="dxa"/>
-              <w:bottom w:w="80" w:type="dxa"/>
+              <w:top w:w="70" w:type="dxa"/>
+              <w:bottom w:w="70" w:type="dxa"/>
               <w:left w:w="120" w:type="dxa"/>
               <w:right w:w="120" w:type="dxa"/>
             </w:tcMar>
           </w:tcPr>
           <w:p>
-            <w:pPr>
-              <w:spacing w:after="0"/>
-            </w:pPr>
             <w:r>
+              <w:rPr>
+                <w:rFonts w:ascii="Arial" w:hAnsi="Arial"/>
+                <w:b w:val="0"/>
+                <w:i w:val="0"/>
+                <w:color w:val="0F172A"/>
+                <w:sz w:val="19"/>
+              </w:rPr>
               <w:t>Dr. / Mr. Academic Supervisor</w:t>
             </w:r>
           </w:p>
@@ -3422,22 +3481,21 @@
         <w:tc>
           <w:tcPr>
             <w:tcW w:type="dxa" w:w="2880"/>
-            <w:shd w:val="clear" w:color="auto" w:fill="F1F5F9"/>
+            <w:shd w:fill="1E293B"/>
             <w:tcMar>
-              <w:top w:w="80" w:type="dxa"/>
-              <w:bottom w:w="80" w:type="dxa"/>
+              <w:top w:w="70" w:type="dxa"/>
+              <w:bottom w:w="70" w:type="dxa"/>
               <w:left w:w="120" w:type="dxa"/>
               <w:right w:w="120" w:type="dxa"/>
             </w:tcMar>
           </w:tcPr>
           <w:p>
-            <w:pPr>
-              <w:spacing w:after="0"/>
-            </w:pPr>
             <w:r>
               <w:rPr>
                 <w:rFonts w:ascii="Arial" w:hAnsi="Arial"/>
                 <w:b/>
+                <w:i w:val="0"/>
+                <w:color w:val="FFFFFF"/>
                 <w:sz w:val="19"/>
               </w:rPr>
               <w:t>Module:</w:t>
@@ -3446,19 +3504,24 @@
         </w:tc>
         <w:tc>
           <w:tcPr>
-            <w:tcW w:type="dxa" w:w="7200"/>
+            <w:tcW w:type="dxa" w:w="6912"/>
+            <w:shd w:fill="F8FAFC"/>
             <w:tcMar>
-              <w:top w:w="80" w:type="dxa"/>
-              <w:bottom w:w="80" w:type="dxa"/>
+              <w:top w:w="70" w:type="dxa"/>
+              <w:bottom w:w="70" w:type="dxa"/>
               <w:left w:w="120" w:type="dxa"/>
               <w:right w:w="120" w:type="dxa"/>
             </w:tcMar>
           </w:tcPr>
           <w:p>
-            <w:pPr>
-              <w:spacing w:after="0"/>
-            </w:pPr>
             <w:r>
+              <w:rPr>
+                <w:rFonts w:ascii="Arial" w:hAnsi="Arial"/>
+                <w:b w:val="0"/>
+                <w:i w:val="0"/>
+                <w:color w:val="0F172A"/>
+                <w:sz w:val="19"/>
+              </w:rPr>
               <w:t>CIS6035 - Software Engineering Project (Dissertation)</w:t>
             </w:r>
           </w:p>
@@ -3468,22 +3531,21 @@
         <w:tc>
           <w:tcPr>
             <w:tcW w:type="dxa" w:w="2880"/>
-            <w:shd w:val="clear" w:color="auto" w:fill="F1F5F9"/>
+            <w:shd w:fill="1E293B"/>
             <w:tcMar>
-              <w:top w:w="80" w:type="dxa"/>
-              <w:bottom w:w="80" w:type="dxa"/>
+              <w:top w:w="70" w:type="dxa"/>
+              <w:bottom w:w="70" w:type="dxa"/>
               <w:left w:w="120" w:type="dxa"/>
               <w:right w:w="120" w:type="dxa"/>
             </w:tcMar>
           </w:tcPr>
           <w:p>
-            <w:pPr>
-              <w:spacing w:after="0"/>
-            </w:pPr>
             <w:r>
               <w:rPr>
                 <w:rFonts w:ascii="Arial" w:hAnsi="Arial"/>
                 <w:b/>
+                <w:i w:val="0"/>
+                <w:color w:val="FFFFFF"/>
                 <w:sz w:val="19"/>
               </w:rPr>
               <w:t>Meeting Details:</w:t>
@@ -3492,19 +3554,24 @@
         </w:tc>
         <w:tc>
           <w:tcPr>
-            <w:tcW w:type="dxa" w:w="7200"/>
+            <w:tcW w:type="dxa" w:w="6912"/>
+            <w:shd w:fill="F8FAFC"/>
             <w:tcMar>
-              <w:top w:w="80" w:type="dxa"/>
-              <w:bottom w:w="80" w:type="dxa"/>
+              <w:top w:w="70" w:type="dxa"/>
+              <w:bottom w:w="70" w:type="dxa"/>
               <w:left w:w="120" w:type="dxa"/>
               <w:right w:w="120" w:type="dxa"/>
             </w:tcMar>
           </w:tcPr>
           <w:p>
-            <w:pPr>
-              <w:spacing w:after="0"/>
-            </w:pPr>
             <w:r>
+              <w:rPr>
+                <w:rFonts w:ascii="Arial" w:hAnsi="Arial"/>
+                <w:b/>
+                <w:i w:val="0"/>
+                <w:color w:val="0F172A"/>
+                <w:sz w:val="19"/>
+              </w:rPr>
               <w:t>Meeting No: 06   |   Date: August 28, 2026   |   Time: 11:00 AM - 11:45 AM (45 Minutes)</w:t>
             </w:r>
           </w:p>
@@ -3520,6 +3587,7 @@
       <w:tblPr>
         <w:tblW w:type="auto" w:w="0"/>
         <w:jc w:val="center"/>
+        <w:tblLayout w:type="fixed"/>
         <w:tblLook w:firstColumn="1" w:firstRow="1" w:lastColumn="0" w:lastRow="0" w:noHBand="0" w:noVBand="1" w:val="04A0"/>
       </w:tblPr>
       <w:tblGrid>
@@ -3529,23 +3597,22 @@
       <w:tr>
         <w:tc>
           <w:tcPr>
-            <w:tcW w:type="dxa" w:w="3168"/>
-            <w:shd w:val="clear" w:color="auto" w:fill="F8FAFC"/>
+            <w:tcW w:type="dxa" w:w="2880"/>
+            <w:shd w:fill="0F172A"/>
             <w:tcMar>
-              <w:top w:w="100" w:type="dxa"/>
-              <w:bottom w:w="100" w:type="dxa"/>
+              <w:top w:w="80" w:type="dxa"/>
+              <w:bottom w:w="80" w:type="dxa"/>
               <w:left w:w="120" w:type="dxa"/>
               <w:right w:w="120" w:type="dxa"/>
             </w:tcMar>
           </w:tcPr>
           <w:p>
-            <w:pPr>
-              <w:spacing w:after="0"/>
-            </w:pPr>
             <w:r>
               <w:rPr>
                 <w:rFonts w:ascii="Arial" w:hAnsi="Arial"/>
                 <w:b/>
+                <w:i w:val="0"/>
+                <w:color w:val="FFFFFF"/>
                 <w:sz w:val="19"/>
               </w:rPr>
               <w:t>Meeting Mode / Location</w:t>
@@ -3555,18 +3622,23 @@
         <w:tc>
           <w:tcPr>
             <w:tcW w:type="dxa" w:w="6912"/>
+            <w:shd w:fill="FFFFFF"/>
             <w:tcMar>
-              <w:top w:w="100" w:type="dxa"/>
-              <w:bottom w:w="100" w:type="dxa"/>
+              <w:top w:w="80" w:type="dxa"/>
+              <w:bottom w:w="80" w:type="dxa"/>
               <w:left w:w="120" w:type="dxa"/>
               <w:right w:w="120" w:type="dxa"/>
             </w:tcMar>
           </w:tcPr>
           <w:p>
-            <w:pPr>
-              <w:spacing w:after="0" w:line="276" w:lineRule="auto"/>
-            </w:pPr>
             <w:r>
+              <w:rPr>
+                <w:rFonts w:ascii="Arial" w:hAnsi="Arial"/>
+                <w:b/>
+                <w:i w:val="0"/>
+                <w:color w:val="0F172A"/>
+                <w:sz w:val="18"/>
+              </w:rPr>
               <w:t>In-Person (ICBT Campus)</w:t>
             </w:r>
           </w:p>
@@ -3575,23 +3647,22 @@
       <w:tr>
         <w:tc>
           <w:tcPr>
-            <w:tcW w:type="dxa" w:w="3168"/>
-            <w:shd w:val="clear" w:color="auto" w:fill="F8FAFC"/>
+            <w:tcW w:type="dxa" w:w="2880"/>
+            <w:shd w:fill="0F172A"/>
             <w:tcMar>
-              <w:top w:w="100" w:type="dxa"/>
-              <w:bottom w:w="100" w:type="dxa"/>
+              <w:top w:w="80" w:type="dxa"/>
+              <w:bottom w:w="80" w:type="dxa"/>
               <w:left w:w="120" w:type="dxa"/>
               <w:right w:w="120" w:type="dxa"/>
             </w:tcMar>
           </w:tcPr>
           <w:p>
-            <w:pPr>
-              <w:spacing w:after="0"/>
-            </w:pPr>
             <w:r>
               <w:rPr>
                 <w:rFonts w:ascii="Arial" w:hAnsi="Arial"/>
                 <w:b/>
+                <w:i w:val="0"/>
+                <w:color w:val="FFFFFF"/>
                 <w:sz w:val="19"/>
               </w:rPr>
               <w:t>Objectives &amp; Agenda</w:t>
@@ -3601,19 +3672,24 @@
         <w:tc>
           <w:tcPr>
             <w:tcW w:type="dxa" w:w="6912"/>
+            <w:shd w:fill="FFFFFF"/>
             <w:tcMar>
-              <w:top w:w="100" w:type="dxa"/>
-              <w:bottom w:w="100" w:type="dxa"/>
+              <w:top w:w="80" w:type="dxa"/>
+              <w:bottom w:w="80" w:type="dxa"/>
               <w:left w:w="120" w:type="dxa"/>
               <w:right w:w="120" w:type="dxa"/>
             </w:tcMar>
           </w:tcPr>
           <w:p>
-            <w:pPr>
-              <w:spacing w:after="0" w:line="276" w:lineRule="auto"/>
-            </w:pPr>
             <w:r>
-              <w:t>Final Project Demonstration, Dissertation Review &amp; Viva Preparation.</w:t>
+              <w:rPr>
+                <w:rFonts w:ascii="Arial" w:hAnsi="Arial"/>
+                <w:b/>
+                <w:i w:val="0"/>
+                <w:color w:val="0F172A"/>
+                <w:sz w:val="18"/>
+              </w:rPr>
+              <w:t>Final System Demonstration, Dissertation Review &amp; Viva Preparation.</w:t>
             </w:r>
           </w:p>
         </w:tc>
@@ -3621,23 +3697,22 @@
       <w:tr>
         <w:tc>
           <w:tcPr>
-            <w:tcW w:type="dxa" w:w="3168"/>
-            <w:shd w:val="clear" w:color="auto" w:fill="F8FAFC"/>
+            <w:tcW w:type="dxa" w:w="2880"/>
+            <w:shd w:fill="0F172A"/>
             <w:tcMar>
-              <w:top w:w="100" w:type="dxa"/>
-              <w:bottom w:w="100" w:type="dxa"/>
+              <w:top w:w="80" w:type="dxa"/>
+              <w:bottom w:w="80" w:type="dxa"/>
               <w:left w:w="120" w:type="dxa"/>
               <w:right w:w="120" w:type="dxa"/>
             </w:tcMar>
           </w:tcPr>
           <w:p>
-            <w:pPr>
-              <w:spacing w:after="0"/>
-            </w:pPr>
             <w:r>
               <w:rPr>
                 <w:rFonts w:ascii="Arial" w:hAnsi="Arial"/>
                 <w:b/>
+                <w:i w:val="0"/>
+                <w:color w:val="FFFFFF"/>
                 <w:sz w:val="19"/>
               </w:rPr>
               <w:t>Discussion Summary &amp; Progress Made</w:t>
@@ -3647,53 +3722,31 @@
         <w:tc>
           <w:tcPr>
             <w:tcW w:type="dxa" w:w="6912"/>
+            <w:shd w:fill="FFFFFF"/>
             <w:tcMar>
-              <w:top w:w="100" w:type="dxa"/>
-              <w:bottom w:w="100" w:type="dxa"/>
+              <w:top w:w="80" w:type="dxa"/>
+              <w:bottom w:w="80" w:type="dxa"/>
               <w:left w:w="120" w:type="dxa"/>
               <w:right w:w="120" w:type="dxa"/>
             </w:tcMar>
           </w:tcPr>
           <w:p>
-            <w:r/>
-          </w:p>
-          <w:p>
-            <w:pPr>
-              <w:spacing w:after="80" w:line="276" w:lineRule="auto"/>
-            </w:pPr>
             <w:r>
+              <w:rPr>
+                <w:rFonts w:ascii="Arial" w:hAnsi="Arial"/>
+                <w:b w:val="0"/>
+                <w:i w:val="0"/>
+                <w:color w:val="0F172A"/>
+                <w:sz w:val="18"/>
+              </w:rPr>
               <w:t>• Presented the fully completed Safora web application deployed on local server and pushed to GitHub version control repository.</w:t>
-            </w:r>
-          </w:p>
-          <w:p>
-            <w:pPr>
-              <w:spacing w:after="80" w:line="276" w:lineRule="auto"/>
-            </w:pPr>
-            <w:r>
+              <w:br/>
               <w:t>• Reviewed complete final dissertation draft (Chapters 1 to 7) including empirical survey analyses, UML/ER diagrams, and testing results.</w:t>
-            </w:r>
-          </w:p>
-          <w:p>
-            <w:pPr>
-              <w:spacing w:after="80" w:line="276" w:lineRule="auto"/>
-            </w:pPr>
-            <w:r>
+              <w:br/>
               <w:t>• Evaluated system performance metrics (98.4% uptime, fast spatial query execution, low memory footprint).</w:t>
-            </w:r>
-          </w:p>
-          <w:p>
-            <w:pPr>
-              <w:spacing w:after="80" w:line="276" w:lineRule="auto"/>
-            </w:pPr>
-            <w:r>
+              <w:br/>
               <w:t>• Conducted preliminary mock viva Q&amp;A session on machine learning model choice, spatial algorithms, and architectural decisions.</w:t>
-            </w:r>
-          </w:p>
-          <w:p>
-            <w:pPr>
-              <w:spacing w:after="80" w:line="276" w:lineRule="auto"/>
-            </w:pPr>
-            <w:r>
+              <w:br/>
               <w:t>• Supervisor granted final approval and signed off on the project for formal submission.</w:t>
             </w:r>
           </w:p>
@@ -3702,23 +3755,22 @@
       <w:tr>
         <w:tc>
           <w:tcPr>
-            <w:tcW w:type="dxa" w:w="3168"/>
-            <w:shd w:val="clear" w:color="auto" w:fill="F8FAFC"/>
+            <w:tcW w:type="dxa" w:w="2880"/>
+            <w:shd w:fill="0F172A"/>
             <w:tcMar>
-              <w:top w:w="100" w:type="dxa"/>
-              <w:bottom w:w="100" w:type="dxa"/>
+              <w:top w:w="80" w:type="dxa"/>
+              <w:bottom w:w="80" w:type="dxa"/>
               <w:left w:w="120" w:type="dxa"/>
               <w:right w:w="120" w:type="dxa"/>
             </w:tcMar>
           </w:tcPr>
           <w:p>
-            <w:pPr>
-              <w:spacing w:after="0"/>
-            </w:pPr>
             <w:r>
               <w:rPr>
                 <w:rFonts w:ascii="Arial" w:hAnsi="Arial"/>
                 <w:b/>
+                <w:i w:val="0"/>
+                <w:color w:val="FFFFFF"/>
                 <w:sz w:val="19"/>
               </w:rPr>
               <w:t>Action Items &amp; Work Assigned</w:t>
@@ -3728,29 +3780,25 @@
         <w:tc>
           <w:tcPr>
             <w:tcW w:type="dxa" w:w="6912"/>
+            <w:shd w:fill="FFFFFF"/>
             <w:tcMar>
-              <w:top w:w="100" w:type="dxa"/>
-              <w:bottom w:w="100" w:type="dxa"/>
+              <w:top w:w="80" w:type="dxa"/>
+              <w:bottom w:w="80" w:type="dxa"/>
               <w:left w:w="120" w:type="dxa"/>
               <w:right w:w="120" w:type="dxa"/>
             </w:tcMar>
           </w:tcPr>
           <w:p>
-            <w:r/>
-          </w:p>
-          <w:p>
-            <w:pPr>
-              <w:spacing w:after="80" w:line="276" w:lineRule="auto"/>
-            </w:pPr>
             <w:r>
+              <w:rPr>
+                <w:rFonts w:ascii="Arial" w:hAnsi="Arial"/>
+                <w:b w:val="0"/>
+                <w:i w:val="0"/>
+                <w:color w:val="0F172A"/>
+                <w:sz w:val="18"/>
+              </w:rPr>
               <w:t>• Bind and submit final dissertation report and source code repository link before deadline.</w:t>
-            </w:r>
-          </w:p>
-          <w:p>
-            <w:pPr>
-              <w:spacing w:after="80" w:line="276" w:lineRule="auto"/>
-            </w:pPr>
-            <w:r>
+              <w:br/>
               <w:t>• Finalize presentation slides for viva defense.</w:t>
             </w:r>
           </w:p>
@@ -3759,23 +3807,22 @@
       <w:tr>
         <w:tc>
           <w:tcPr>
-            <w:tcW w:type="dxa" w:w="3168"/>
-            <w:shd w:val="clear" w:color="auto" w:fill="F8FAFC"/>
+            <w:tcW w:type="dxa" w:w="2880"/>
+            <w:shd w:fill="0F172A"/>
             <w:tcMar>
-              <w:top w:w="100" w:type="dxa"/>
-              <w:bottom w:w="100" w:type="dxa"/>
+              <w:top w:w="80" w:type="dxa"/>
+              <w:bottom w:w="80" w:type="dxa"/>
               <w:left w:w="120" w:type="dxa"/>
               <w:right w:w="120" w:type="dxa"/>
             </w:tcMar>
           </w:tcPr>
           <w:p>
-            <w:pPr>
-              <w:spacing w:after="0"/>
-            </w:pPr>
             <w:r>
               <w:rPr>
                 <w:rFonts w:ascii="Arial" w:hAnsi="Arial"/>
                 <w:b/>
+                <w:i w:val="0"/>
+                <w:color w:val="FFFFFF"/>
                 <w:sz w:val="19"/>
               </w:rPr>
               <w:t>Target Completion Date</w:t>
@@ -3785,18 +3832,23 @@
         <w:tc>
           <w:tcPr>
             <w:tcW w:type="dxa" w:w="6912"/>
+            <w:shd w:fill="FFFFFF"/>
             <w:tcMar>
-              <w:top w:w="100" w:type="dxa"/>
-              <w:bottom w:w="100" w:type="dxa"/>
+              <w:top w:w="80" w:type="dxa"/>
+              <w:bottom w:w="80" w:type="dxa"/>
               <w:left w:w="120" w:type="dxa"/>
               <w:right w:w="120" w:type="dxa"/>
             </w:tcMar>
           </w:tcPr>
           <w:p>
-            <w:pPr>
-              <w:spacing w:after="0" w:line="276" w:lineRule="auto"/>
-            </w:pPr>
             <w:r>
+              <w:rPr>
+                <w:rFonts w:ascii="Arial" w:hAnsi="Arial"/>
+                <w:b/>
+                <w:i w:val="0"/>
+                <w:color w:val="0F172A"/>
+                <w:sz w:val="18"/>
+              </w:rPr>
               <w:t>August 30, 2026</w:t>
             </w:r>
           </w:p>
@@ -3812,6 +3864,7 @@
       <w:tblPr>
         <w:tblW w:type="auto" w:w="0"/>
         <w:jc w:val="center"/>
+        <w:tblLayout w:type="fixed"/>
         <w:tblLook w:firstColumn="1" w:firstRow="1" w:lastColumn="0" w:lastRow="0" w:noHBand="0" w:noVBand="1" w:val="04A0"/>
       </w:tblPr>
       <w:tblGrid>
@@ -3820,46 +3873,52 @@
       <w:tr>
         <w:tc>
           <w:tcPr>
-            <w:tcW w:type="dxa" w:w="10080"/>
+            <w:tcW w:type="dxa" w:w="9792"/>
+            <w:shd w:fill="F8FAFC"/>
             <w:tcMar>
-              <w:top w:w="100" w:type="dxa"/>
-              <w:bottom w:w="100" w:type="dxa"/>
+              <w:top w:w="80" w:type="dxa"/>
+              <w:bottom w:w="120" w:type="dxa"/>
               <w:left w:w="120" w:type="dxa"/>
               <w:right w:w="120" w:type="dxa"/>
             </w:tcMar>
           </w:tcPr>
           <w:p>
-            <w:pPr>
-              <w:spacing w:after="0"/>
-            </w:pPr>
             <w:r>
+              <w:rPr>
+                <w:rFonts w:ascii="Arial" w:hAnsi="Arial"/>
+                <w:b/>
+                <w:i w:val="0"/>
+                <w:color w:val="0F172A"/>
+                <w:sz w:val="19"/>
+              </w:rPr>
               <w:t>Supervisor Comments / Feedback:</w:t>
+              <w:br/>
+              <w:br/>
             </w:r>
-          </w:p>
-          <w:p>
-            <w:pPr>
-              <w:spacing w:after="500"/>
-            </w:pPr>
           </w:p>
         </w:tc>
       </w:tr>
       <w:tr>
         <w:tc>
           <w:tcPr>
-            <w:tcW w:type="dxa" w:w="10080"/>
+            <w:tcW w:type="dxa" w:w="9792"/>
+            <w:shd w:fill="FFFFFF"/>
             <w:tcMar>
-              <w:top w:w="80" w:type="dxa"/>
-              <w:bottom w:w="80" w:type="dxa"/>
+              <w:top w:w="70" w:type="dxa"/>
+              <w:bottom w:w="70" w:type="dxa"/>
               <w:left w:w="120" w:type="dxa"/>
               <w:right w:w="120" w:type="dxa"/>
             </w:tcMar>
-            <w:shd w:val="clear" w:color="auto" w:fill="F8FAFC"/>
           </w:tcPr>
           <w:p>
-            <w:pPr>
-              <w:spacing w:after="0"/>
-            </w:pPr>
             <w:r>
+              <w:rPr>
+                <w:rFonts w:ascii="Arial" w:hAnsi="Arial"/>
+                <w:b/>
+                <w:i w:val="0"/>
+                <w:color w:val="0F172A"/>
+                <w:sz w:val="19"/>
+              </w:rPr>
               <w:t>Supervisor Approval Status:   [  ] Satisfactory Progress      [  ] Action Required</w:t>
             </w:r>
           </w:p>
@@ -3868,20 +3927,27 @@
       <w:tr>
         <w:tc>
           <w:tcPr>
-            <w:tcW w:type="dxa" w:w="10080"/>
+            <w:tcW w:type="dxa" w:w="9792"/>
+            <w:shd w:fill="F8FAFC"/>
             <w:tcMar>
-              <w:top w:w="120" w:type="dxa"/>
-              <w:bottom w:w="120" w:type="dxa"/>
+              <w:top w:w="80" w:type="dxa"/>
+              <w:bottom w:w="80" w:type="dxa"/>
               <w:left w:w="120" w:type="dxa"/>
               <w:right w:w="120" w:type="dxa"/>
             </w:tcMar>
           </w:tcPr>
           <w:p>
-            <w:pPr>
-              <w:spacing w:after="0"/>
-            </w:pPr>
             <w:r>
-              <w:t>Signatures &amp; Date: Student Signature: _______________________    Date: ____________    Supervisor Signature: ____________________    Date: ____________</w:t>
+              <w:rPr>
+                <w:rFonts w:ascii="Arial" w:hAnsi="Arial"/>
+                <w:b w:val="0"/>
+                <w:i w:val="0"/>
+                <w:color w:val="0F172A"/>
+                <w:sz w:val="18"/>
+              </w:rPr>
+              <w:t>Signatures &amp; Date:</w:t>
+              <w:br/>
+              <w:t>Student Signature: _______________________    Date: ____________    Supervisor Signature: ____________________    Date: ____________</w:t>
             </w:r>
           </w:p>
         </w:tc>
@@ -3889,7 +3955,7 @@
     </w:tbl>
     <w:sectPr>
       <w:pgSz w:w="12240" w:h="15840"/>
-      <w:pgMar w:top="1008" w:right="1080" w:bottom="1008" w:left="1080" w:header="720" w:footer="720" w:gutter="0"/>
+      <w:pgMar w:top="1080" w:right="1080" w:bottom="1080" w:left="1080" w:header="720" w:footer="720" w:gutter="0"/>
       <w:cols w:space="720"/>
       <w:docGrid w:linePitch="360"/>
     </w:sectPr>

</xml_diff>